<commit_message>
ajuste guia funcional v3
</commit_message>
<xml_diff>
--- a/entrega_pruebas_funcionales_usuarios/paquete_final/Guia_funcional_pruebas_locales_ACH_Interbank_ACH_COLOMBIA_CENIT_MANUAL_OPERATIVO_COMPLETO_FLUJOS_SUBPANTALLAS.docx
+++ b/entrega_pruebas_funcionales_usuarios/paquete_final/Guia_funcional_pruebas_locales_ACH_Interbank_ACH_COLOMBIA_CENIT_MANUAL_OPERATIVO_COMPLETO_FLUJOS_SUBPANTALLAS.docx
@@ -21508,14 +21508,2595 @@
       </w:r>
     </w:p>
     <w:p>
+      <w:r>
+        <w:br w:type="page"/>
+      </w:r>
+    </w:p>
+    <w:p>
       <w:pPr>
         <w:pStyle w:val="Ttulo1"/>
       </w:pPr>
       <w:r>
+        <w:t xml:space="preserve">35. Ampliación funcional V3</w:t>
+      </w:r>
+    </w:p>
+    <w:p>
+      <w:pPr>
+        <w:pStyle w:val="Normal"/>
+      </w:pPr>
+      <w:r>
+        <w:t xml:space="preserve">Esta ampliación incorpora las pantallas funcionales aprobadas en el barrido dirigido y deja asociada la evidencia textual correspondiente.</w:t>
+      </w:r>
+    </w:p>
+    <w:p>
+      <w:pPr>
+        <w:pStyle w:val="Ttulo2"/>
+      </w:pPr>
+      <w:r>
+        <w:t xml:space="preserve">35.1 Actores funcionales del manual</w:t>
+      </w:r>
+    </w:p>
+    <w:p>
+      <w:pPr>
+        <w:pStyle w:val="Normal"/>
+      </w:pPr>
+      <w:r>
+        <w:t xml:space="preserve">Ordena los perfiles que participan en la ampliación del manual y evita cruces de responsabilidad.</w:t>
+      </w:r>
+    </w:p>
+    <w:p>
+      <w:pPr>
+        <w:pStyle w:val="Listaconvietas"/>
+      </w:pPr>
+      <w:r>
+        <w:rPr>
+          <w:b/>
+        </w:rPr>
+        <w:t xml:space="preserve">Actor principal: </w:t>
+      </w:r>
+      <w:r>
+        <w:t xml:space="preserve">Usuario funcional de pruebas</w:t>
+      </w:r>
+    </w:p>
+    <w:p>
+      <w:pPr>
+        <w:pStyle w:val="Listaconvietas"/>
+      </w:pPr>
+      <w:r>
+        <w:rPr>
+          <w:b/>
+        </w:rPr>
+        <w:t xml:space="preserve">Actores secundarios: </w:t>
+      </w:r>
+      <w:r>
+        <w:t xml:space="preserve">Operador ACH; Revisor / validador operativo; Soporte técnico funcional</w:t>
+      </w:r>
+    </w:p>
+    <w:p>
+      <w:pPr>
+        <w:pStyle w:val="Listaconvietas"/>
+      </w:pPr>
+      <w:r>
+        <w:rPr>
+          <w:b/>
+        </w:rPr>
+        <w:t xml:space="preserve">Para qué sirve: </w:t>
+      </w:r>
+      <w:r>
+        <w:t xml:space="preserve">Definir quién ejecuta, quién valida y quién reporta cada escenario.</w:t>
+      </w:r>
+    </w:p>
+    <w:p>
+      <w:pPr>
+        <w:pStyle w:val="Listaconvietas"/>
+      </w:pPr>
+      <w:r>
+        <w:rPr>
+          <w:b/>
+        </w:rPr>
+        <w:t xml:space="preserve">Cuándo la usa: </w:t>
+      </w:r>
+      <w:r>
+        <w:t xml:space="preserve">Se usa al inicio de la jornada y antes de clasificar incidencias.</w:t>
+      </w:r>
+    </w:p>
+    <w:p>
+      <w:pPr>
+        <w:pStyle w:val="Listaconvietas"/>
+      </w:pPr>
+      <w:r>
+        <w:rPr>
+          <w:b/>
+        </w:rPr>
+        <w:t xml:space="preserve">Pasos funcionales: </w:t>
+      </w:r>
+      <w:r>
+        <w:t xml:space="preserve">Confirmar el rol, abrir la pantalla correspondiente y registrar la evidencia de forma ordenada.</w:t>
+      </w:r>
+    </w:p>
+    <w:p>
+      <w:pPr>
+        <w:pStyle w:val="Listaconvietas"/>
+      </w:pPr>
+      <w:r>
+        <w:rPr>
+          <w:b/>
+        </w:rPr>
+        <w:t xml:space="preserve">Qué debe validar: </w:t>
+      </w:r>
+      <w:r>
+        <w:t xml:space="preserve">Que cada escenario tenga un actor principal y un responsable de seguimiento.</w:t>
+      </w:r>
+    </w:p>
+    <w:p>
+      <w:pPr>
+        <w:pStyle w:val="Listaconvietas"/>
+      </w:pPr>
+      <w:r>
+        <w:rPr>
+          <w:b/>
+        </w:rPr>
+        <w:t xml:space="preserve">Qué errores debe reportar: </w:t>
+      </w:r>
+      <w:r>
+        <w:t xml:space="preserve">Reportar confusión de roles, escenarios sin dueño o validaciones mezcladas.</w:t>
+      </w:r>
+    </w:p>
+    <w:p>
+      <w:pPr>
+        <w:pStyle w:val="Listaconvietas"/>
+      </w:pPr>
+      <w:r>
+        <w:rPr>
+          <w:b/>
+        </w:rPr>
+        <w:t xml:space="preserve">Captura asociada: </w:t>
+      </w:r>
+      <w:r>
+        <w:t xml:space="preserve">No aplica</w:t>
+      </w:r>
+    </w:p>
+    <w:p>
+      <w:pPr>
+        <w:pStyle w:val="Ttulo2"/>
+      </w:pPr>
+      <w:r>
+        <w:t xml:space="preserve">35.2 Preparación funcional de datos maestros</w:t>
+      </w:r>
+    </w:p>
+    <w:p>
+      <w:pPr>
+        <w:pStyle w:val="Normal"/>
+      </w:pPr>
+      <w:r>
+        <w:t xml:space="preserve">Consolida la información base que debe existir antes de ejecutar altas, reglas o ciclos.</w:t>
+      </w:r>
+    </w:p>
+    <w:p>
+      <w:pPr>
+        <w:pStyle w:val="Listaconvietas"/>
+      </w:pPr>
+      <w:r>
+        <w:rPr>
+          <w:b/>
+        </w:rPr>
+        <w:t xml:space="preserve">Actor principal: </w:t>
+      </w:r>
+      <w:r>
+        <w:t xml:space="preserve">Administrador de catálogos / parametrización</w:t>
+      </w:r>
+    </w:p>
+    <w:p>
+      <w:pPr>
+        <w:pStyle w:val="Listaconvietas"/>
+      </w:pPr>
+      <w:r>
+        <w:rPr>
+          <w:b/>
+        </w:rPr>
+        <w:t xml:space="preserve">Actores secundarios: </w:t>
+      </w:r>
+      <w:r>
+        <w:t xml:space="preserve">Administrador funcional ACH; Operador ACH</w:t>
+      </w:r>
+    </w:p>
+    <w:p>
+      <w:pPr>
+        <w:pStyle w:val="Listaconvietas"/>
+      </w:pPr>
+      <w:r>
+        <w:rPr>
+          <w:b/>
+        </w:rPr>
+        <w:t xml:space="preserve">Para qué sirve: </w:t>
+      </w:r>
+      <w:r>
+        <w:t xml:space="preserve">Dejar listos los catálogos y prioridades que consumen las demás pantallas.</w:t>
+      </w:r>
+    </w:p>
+    <w:p>
+      <w:pPr>
+        <w:pStyle w:val="Listaconvietas"/>
+      </w:pPr>
+      <w:r>
+        <w:rPr>
+          <w:b/>
+        </w:rPr>
+        <w:t xml:space="preserve">Cuándo la usa: </w:t>
+      </w:r>
+      <w:r>
+        <w:t xml:space="preserve">Antes de crear clientes, terceros, entidades financieras o reglas por cámara.</w:t>
+      </w:r>
+    </w:p>
+    <w:p>
+      <w:pPr>
+        <w:pStyle w:val="Listaconvietas"/>
+      </w:pPr>
+      <w:r>
+        <w:rPr>
+          <w:b/>
+        </w:rPr>
+        <w:t xml:space="preserve">Pasos funcionales: </w:t>
+      </w:r>
+      <w:r>
+        <w:t xml:space="preserve">Revisar catálogos, confirmar vigencias visibles y validar que no falten registros básicos.</w:t>
+      </w:r>
+    </w:p>
+    <w:p>
+      <w:pPr>
+        <w:pStyle w:val="Listaconvietas"/>
+      </w:pPr>
+      <w:r>
+        <w:rPr>
+          <w:b/>
+        </w:rPr>
+        <w:t xml:space="preserve">Qué debe validar: </w:t>
+      </w:r>
+      <w:r>
+        <w:t xml:space="preserve">Que la información maestra sea consistente con la cámara y el escenario de prueba.</w:t>
+      </w:r>
+    </w:p>
+    <w:p>
+      <w:pPr>
+        <w:pStyle w:val="Listaconvietas"/>
+      </w:pPr>
+      <w:r>
+        <w:rPr>
+          <w:b/>
+        </w:rPr>
+        <w:t xml:space="preserve">Qué errores debe reportar: </w:t>
+      </w:r>
+      <w:r>
+        <w:t xml:space="preserve">Reportar registros duplicados, catálogos incompletos o datos inactivos inesperados.</w:t>
+      </w:r>
+    </w:p>
+    <w:p>
+      <w:pPr>
+        <w:pStyle w:val="Listaconvietas"/>
+      </w:pPr>
+      <w:r>
+        <w:rPr>
+          <w:b/>
+        </w:rPr>
+        <w:t xml:space="preserve">Captura asociada: </w:t>
+      </w:r>
+      <w:r>
+        <w:t xml:space="preserve">32_financial_institutions_mantenimiento_digito_verificacion.png; 34_catalog_document_types.png; 35_catalog_gender_types.png; 36_catalog_person_types.png; 37_catalog_transaction_codes.png; 38_catalog_company_entry_descriptions.png</w:t>
+      </w:r>
+    </w:p>
+    <w:p>
+      <w:pPr>
+        <w:pStyle w:val="Ttulo2"/>
+      </w:pPr>
+      <w:r>
+        <w:t xml:space="preserve">35.3 Onboarding silencioso, si existe</w:t>
+      </w:r>
+    </w:p>
+    <w:p>
+      <w:pPr>
+        <w:pStyle w:val="Normal"/>
+      </w:pPr>
+      <w:r>
+        <w:t xml:space="preserve">Permite detectar si la aplicación ofrece ayuda automática, prellenado o pasos invisibles durante las altas.</w:t>
+      </w:r>
+    </w:p>
+    <w:p>
+      <w:pPr>
+        <w:pStyle w:val="Listaconvietas"/>
+      </w:pPr>
+      <w:r>
+        <w:rPr>
+          <w:b/>
+        </w:rPr>
+        <w:t xml:space="preserve">Actor principal: </w:t>
+      </w:r>
+      <w:r>
+        <w:t xml:space="preserve">Usuario funcional de pruebas</w:t>
+      </w:r>
+    </w:p>
+    <w:p>
+      <w:pPr>
+        <w:pStyle w:val="Listaconvietas"/>
+      </w:pPr>
+      <w:r>
+        <w:rPr>
+          <w:b/>
+        </w:rPr>
+        <w:t xml:space="preserve">Actores secundarios: </w:t>
+      </w:r>
+      <w:r>
+        <w:t xml:space="preserve">Soporte técnico funcional</w:t>
+      </w:r>
+    </w:p>
+    <w:p>
+      <w:pPr>
+        <w:pStyle w:val="Listaconvietas"/>
+      </w:pPr>
+      <w:r>
+        <w:rPr>
+          <w:b/>
+        </w:rPr>
+        <w:t xml:space="preserve">Para qué sirve: </w:t>
+      </w:r>
+      <w:r>
+        <w:t xml:space="preserve">Verificar si el flujo guía al usuario sin mostrar una pantalla dedicada.</w:t>
+      </w:r>
+    </w:p>
+    <w:p>
+      <w:pPr>
+        <w:pStyle w:val="Listaconvietas"/>
+      </w:pPr>
+      <w:r>
+        <w:rPr>
+          <w:b/>
+        </w:rPr>
+        <w:t xml:space="preserve">Cuándo la usa: </w:t>
+      </w:r>
+      <w:r>
+        <w:t xml:space="preserve">Durante la creación de clientes o de datos maestros, si la interfaz muestra ayuda automática.</w:t>
+      </w:r>
+    </w:p>
+    <w:p>
+      <w:pPr>
+        <w:pStyle w:val="Listaconvietas"/>
+      </w:pPr>
+      <w:r>
+        <w:rPr>
+          <w:b/>
+        </w:rPr>
+        <w:t xml:space="preserve">Pasos funcionales: </w:t>
+      </w:r>
+      <w:r>
+        <w:t xml:space="preserve">Abrir una alta, observar si aparecen ayudas o valores precargados y registrar lo visible.</w:t>
+      </w:r>
+    </w:p>
+    <w:p>
+      <w:pPr>
+        <w:pStyle w:val="Listaconvietas"/>
+      </w:pPr>
+      <w:r>
+        <w:rPr>
+          <w:b/>
+        </w:rPr>
+        <w:t xml:space="preserve">Qué debe validar: </w:t>
+      </w:r>
+      <w:r>
+        <w:t xml:space="preserve">Que cualquier ayuda automática sea clara y no cambie datos sin aviso.</w:t>
+      </w:r>
+    </w:p>
+    <w:p>
+      <w:pPr>
+        <w:pStyle w:val="Listaconvietas"/>
+      </w:pPr>
+      <w:r>
+        <w:rPr>
+          <w:b/>
+        </w:rPr>
+        <w:t xml:space="preserve">Qué errores debe reportar: </w:t>
+      </w:r>
+      <w:r>
+        <w:t xml:space="preserve">Reportar si aparece un flujo automático confuso o si no se puede continuar.</w:t>
+      </w:r>
+    </w:p>
+    <w:p>
+      <w:pPr>
+        <w:pStyle w:val="Listaconvietas"/>
+      </w:pPr>
+      <w:r>
+        <w:rPr>
+          <w:b/>
+        </w:rPr>
+        <w:t xml:space="preserve">Captura asociada: </w:t>
+      </w:r>
+      <w:r>
+        <w:t xml:space="preserve">50_onboarding_silencioso_si_aparece.png</w:t>
+      </w:r>
+    </w:p>
+    <w:p>
+      <w:pPr>
+        <w:pStyle w:val="Ttulo2"/>
+      </w:pPr>
+      <w:r>
+        <w:t xml:space="preserve">35.4 Administración de terceros de prenotificación</w:t>
+      </w:r>
+    </w:p>
+    <w:p>
+      <w:pPr>
+        <w:pStyle w:val="Normal"/>
+      </w:pPr>
+      <w:r>
+        <w:t xml:space="preserve">Cubre la consulta y revisión de terceros usados en prenotificación.</w:t>
+      </w:r>
+    </w:p>
+    <w:p>
+      <w:pPr>
+        <w:pStyle w:val="Listaconvietas"/>
+      </w:pPr>
+      <w:r>
+        <w:rPr>
+          <w:b/>
+        </w:rPr>
+        <w:t xml:space="preserve">Actor principal: </w:t>
+      </w:r>
+      <w:r>
+        <w:t xml:space="preserve">Operador ACH</w:t>
+      </w:r>
+    </w:p>
+    <w:p>
+      <w:pPr>
+        <w:pStyle w:val="Listaconvietas"/>
+      </w:pPr>
+      <w:r>
+        <w:rPr>
+          <w:b/>
+        </w:rPr>
+        <w:t xml:space="preserve">Actores secundarios: </w:t>
+      </w:r>
+      <w:r>
+        <w:t xml:space="preserve">Revisor / validador operativo</w:t>
+      </w:r>
+    </w:p>
+    <w:p>
+      <w:pPr>
+        <w:pStyle w:val="Listaconvietas"/>
+      </w:pPr>
+      <w:r>
+        <w:rPr>
+          <w:b/>
+        </w:rPr>
+        <w:t xml:space="preserve">Para qué sirve: </w:t>
+      </w:r>
+      <w:r>
+        <w:t xml:space="preserve">Consultar terceros y validar su estado operativo antes de una prenotificación.</w:t>
+      </w:r>
+    </w:p>
+    <w:p>
+      <w:pPr>
+        <w:pStyle w:val="Listaconvietas"/>
+      </w:pPr>
+      <w:r>
+        <w:rPr>
+          <w:b/>
+        </w:rPr>
+        <w:t xml:space="preserve">Cuándo la usa: </w:t>
+      </w:r>
+      <w:r>
+        <w:t xml:space="preserve">Antes de aprobar, revisar o rechazar un tercero relacionado con prenotificación.</w:t>
+      </w:r>
+    </w:p>
+    <w:p>
+      <w:pPr>
+        <w:pStyle w:val="Listaconvietas"/>
+      </w:pPr>
+      <w:r>
+        <w:rPr>
+          <w:b/>
+        </w:rPr>
+        <w:t xml:space="preserve">Pasos funcionales: </w:t>
+      </w:r>
+      <w:r>
+        <w:t xml:space="preserve">Buscar el tercero, revisar sus datos y confirmar si el estado permite continuar.</w:t>
+      </w:r>
+    </w:p>
+    <w:p>
+      <w:pPr>
+        <w:pStyle w:val="Listaconvietas"/>
+      </w:pPr>
+      <w:r>
+        <w:rPr>
+          <w:b/>
+        </w:rPr>
+        <w:t xml:space="preserve">Qué debe validar: </w:t>
+      </w:r>
+      <w:r>
+        <w:t xml:space="preserve">Que el tercero, la cuenta y el estado coincidan con el caso de prueba.</w:t>
+      </w:r>
+    </w:p>
+    <w:p>
+      <w:pPr>
+        <w:pStyle w:val="Listaconvietas"/>
+      </w:pPr>
+      <w:r>
+        <w:rPr>
+          <w:b/>
+        </w:rPr>
+        <w:t xml:space="preserve">Qué errores debe reportar: </w:t>
+      </w:r>
+      <w:r>
+        <w:t xml:space="preserve">Reportar estados inesperados, datos incompletos o inconsistencias de receptor.</w:t>
+      </w:r>
+    </w:p>
+    <w:p>
+      <w:pPr>
+        <w:pStyle w:val="Listaconvietas"/>
+      </w:pPr>
+      <w:r>
+        <w:rPr>
+          <w:b/>
+        </w:rPr>
+        <w:t xml:space="preserve">Captura asociada: </w:t>
+      </w:r>
+      <w:r>
+        <w:t xml:space="preserve">28_customer_third_parties_listado_busqueda.png; 29_customer_third_parties_creacion_si_existe.png</w:t>
+      </w:r>
+    </w:p>
+    <w:p>
+      <w:pPr>
+        <w:pStyle w:val="Ttulo2"/>
+      </w:pPr>
+      <w:r>
+        <w:t xml:space="preserve">35.5 Administración de clientes</w:t>
+      </w:r>
+    </w:p>
+    <w:p>
+      <w:pPr>
+        <w:pStyle w:val="Normal"/>
+      </w:pPr>
+      <w:r>
+        <w:t xml:space="preserve">Agrupa la consulta y el alta de clientes que alimentan la operación ACH.</w:t>
+      </w:r>
+    </w:p>
+    <w:p>
+      <w:pPr>
+        <w:pStyle w:val="Listaconvietas"/>
+      </w:pPr>
+      <w:r>
+        <w:rPr>
+          <w:b/>
+        </w:rPr>
+        <w:t xml:space="preserve">Actor principal: </w:t>
+      </w:r>
+      <w:r>
+        <w:t xml:space="preserve">Operador ACH</w:t>
+      </w:r>
+    </w:p>
+    <w:p>
+      <w:pPr>
+        <w:pStyle w:val="Listaconvietas"/>
+      </w:pPr>
+      <w:r>
+        <w:rPr>
+          <w:b/>
+        </w:rPr>
+        <w:t xml:space="preserve">Actores secundarios: </w:t>
+      </w:r>
+      <w:r>
+        <w:t xml:space="preserve">Usuario funcional de pruebas</w:t>
+      </w:r>
+    </w:p>
+    <w:p>
+      <w:pPr>
+        <w:pStyle w:val="Listaconvietas"/>
+      </w:pPr>
+      <w:r>
+        <w:rPr>
+          <w:b/>
+        </w:rPr>
+        <w:t xml:space="preserve">Para qué sirve: </w:t>
+      </w:r>
+      <w:r>
+        <w:t xml:space="preserve">Registrar o consultar clientes asociados a escenarios funcionales.</w:t>
+      </w:r>
+    </w:p>
+    <w:p>
+      <w:pPr>
+        <w:pStyle w:val="Listaconvietas"/>
+      </w:pPr>
+      <w:r>
+        <w:rPr>
+          <w:b/>
+        </w:rPr>
+        <w:t xml:space="preserve">Cuándo la usa: </w:t>
+      </w:r>
+      <w:r>
+        <w:t xml:space="preserve">Cuando el caso requiere crear o revisar un cliente de prueba.</w:t>
+      </w:r>
+    </w:p>
+    <w:p>
+      <w:pPr>
+        <w:pStyle w:val="Listaconvietas"/>
+      </w:pPr>
+      <w:r>
+        <w:rPr>
+          <w:b/>
+        </w:rPr>
+        <w:t xml:space="preserve">Pasos funcionales: </w:t>
+      </w:r>
+      <w:r>
+        <w:t xml:space="preserve">Abrir la lista, entrar al alta o edición y guardar solo si la información es válida.</w:t>
+      </w:r>
+    </w:p>
+    <w:p>
+      <w:pPr>
+        <w:pStyle w:val="Listaconvietas"/>
+      </w:pPr>
+      <w:r>
+        <w:rPr>
+          <w:b/>
+        </w:rPr>
+        <w:t xml:space="preserve">Qué debe validar: </w:t>
+      </w:r>
+      <w:r>
+        <w:t xml:space="preserve">Que el cliente quede visible y con los datos esperados en pantalla.</w:t>
+      </w:r>
+    </w:p>
+    <w:p>
+      <w:pPr>
+        <w:pStyle w:val="Listaconvietas"/>
+      </w:pPr>
+      <w:r>
+        <w:rPr>
+          <w:b/>
+        </w:rPr>
+        <w:t xml:space="preserve">Qué errores debe reportar: </w:t>
+      </w:r>
+      <w:r>
+        <w:t xml:space="preserve">Reportar validaciones fallidas, campos obligatorios vacíos o navegación incorrecta.</w:t>
+      </w:r>
+    </w:p>
+    <w:p>
+      <w:pPr>
+        <w:pStyle w:val="Listaconvietas"/>
+      </w:pPr>
+      <w:r>
+        <w:rPr>
+          <w:b/>
+        </w:rPr>
+        <w:t xml:space="preserve">Captura asociada: </w:t>
+      </w:r>
+      <w:r>
+        <w:t xml:space="preserve">30_customers_listado.png; 31_customers_nuevo.png</w:t>
+      </w:r>
+    </w:p>
+    <w:p>
+      <w:pPr>
+        <w:pStyle w:val="Ttulo2"/>
+      </w:pPr>
+      <w:r>
+        <w:t xml:space="preserve">35.6 Administración de entidades financieras</w:t>
+      </w:r>
+    </w:p>
+    <w:p>
+      <w:pPr>
+        <w:pStyle w:val="Normal"/>
+      </w:pPr>
+      <w:r>
+        <w:t xml:space="preserve">Reúne la consulta y mantenimiento de entidades financieras usadas por la operación.</w:t>
+      </w:r>
+    </w:p>
+    <w:p>
+      <w:pPr>
+        <w:pStyle w:val="Listaconvietas"/>
+      </w:pPr>
+      <w:r>
+        <w:rPr>
+          <w:b/>
+        </w:rPr>
+        <w:t xml:space="preserve">Actor principal: </w:t>
+      </w:r>
+      <w:r>
+        <w:t xml:space="preserve">Administrador de catálogos / parametrización</w:t>
+      </w:r>
+    </w:p>
+    <w:p>
+      <w:pPr>
+        <w:pStyle w:val="Listaconvietas"/>
+      </w:pPr>
+      <w:r>
+        <w:rPr>
+          <w:b/>
+        </w:rPr>
+        <w:t xml:space="preserve">Actores secundarios: </w:t>
+      </w:r>
+      <w:r>
+        <w:t xml:space="preserve">Administrador funcional ACH</w:t>
+      </w:r>
+    </w:p>
+    <w:p>
+      <w:pPr>
+        <w:pStyle w:val="Listaconvietas"/>
+      </w:pPr>
+      <w:r>
+        <w:rPr>
+          <w:b/>
+        </w:rPr>
+        <w:t xml:space="preserve">Para qué sirve: </w:t>
+      </w:r>
+      <w:r>
+        <w:t xml:space="preserve">Mantener routing, tránsito, estado y dígito visible cuando aplique.</w:t>
+      </w:r>
+    </w:p>
+    <w:p>
+      <w:pPr>
+        <w:pStyle w:val="Listaconvietas"/>
+      </w:pPr>
+      <w:r>
+        <w:rPr>
+          <w:b/>
+        </w:rPr>
+        <w:t xml:space="preserve">Cuándo la usa: </w:t>
+      </w:r>
+      <w:r>
+        <w:t xml:space="preserve">Antes de ejecutar pruebas que dependan de la entidad destino u origen.</w:t>
+      </w:r>
+    </w:p>
+    <w:p>
+      <w:pPr>
+        <w:pStyle w:val="Listaconvietas"/>
+      </w:pPr>
+      <w:r>
+        <w:rPr>
+          <w:b/>
+        </w:rPr>
+        <w:t xml:space="preserve">Pasos funcionales: </w:t>
+      </w:r>
+      <w:r>
+        <w:t xml:space="preserve">Abrir el catálogo, revisar el registro y confirmar los datos visibles del mantenimiento.</w:t>
+      </w:r>
+    </w:p>
+    <w:p>
+      <w:pPr>
+        <w:pStyle w:val="Listaconvietas"/>
+      </w:pPr>
+      <w:r>
+        <w:rPr>
+          <w:b/>
+        </w:rPr>
+        <w:t xml:space="preserve">Qué debe validar: </w:t>
+      </w:r>
+      <w:r>
+        <w:t xml:space="preserve">Que la entidad tenga estado, códigos y dígito coherentes con la pantalla.</w:t>
+      </w:r>
+    </w:p>
+    <w:p>
+      <w:pPr>
+        <w:pStyle w:val="Listaconvietas"/>
+      </w:pPr>
+      <w:r>
+        <w:rPr>
+          <w:b/>
+        </w:rPr>
+        <w:t xml:space="preserve">Qué errores debe reportar: </w:t>
+      </w:r>
+      <w:r>
+        <w:t xml:space="preserve">Reportar dígito ausente, estados inactivos inesperados o inconsistencias de edición.</w:t>
+      </w:r>
+    </w:p>
+    <w:p>
+      <w:pPr>
+        <w:pStyle w:val="Listaconvietas"/>
+      </w:pPr>
+      <w:r>
+        <w:rPr>
+          <w:b/>
+        </w:rPr>
+        <w:t xml:space="preserve">Captura asociada: </w:t>
+      </w:r>
+      <w:r>
+        <w:t xml:space="preserve">32_financial_institutions_mantenimiento_digito_verificacion.png</w:t>
+      </w:r>
+    </w:p>
+    <w:p>
+      <w:pPr>
+        <w:pStyle w:val="Ttulo2"/>
+      </w:pPr>
+      <w:r>
+        <w:t xml:space="preserve">35.7 Priorización por cámara ACH Colombia / CENIT</w:t>
+      </w:r>
+    </w:p>
+    <w:p>
+      <w:pPr>
+        <w:pStyle w:val="Normal"/>
+      </w:pPr>
+      <w:r>
+        <w:t xml:space="preserve">Muestra cómo se ordenan las preferencias funcionales por cámara.</w:t>
+      </w:r>
+    </w:p>
+    <w:p>
+      <w:pPr>
+        <w:pStyle w:val="Listaconvietas"/>
+      </w:pPr>
+      <w:r>
+        <w:rPr>
+          <w:b/>
+        </w:rPr>
+        <w:t xml:space="preserve">Actor principal: </w:t>
+      </w:r>
+      <w:r>
+        <w:t xml:space="preserve">Administrador funcional ACH</w:t>
+      </w:r>
+    </w:p>
+    <w:p>
+      <w:pPr>
+        <w:pStyle w:val="Listaconvietas"/>
+      </w:pPr>
+      <w:r>
+        <w:rPr>
+          <w:b/>
+        </w:rPr>
+        <w:t xml:space="preserve">Actores secundarios: </w:t>
+      </w:r>
+      <w:r>
+        <w:t xml:space="preserve">Operador ACH</w:t>
+      </w:r>
+    </w:p>
+    <w:p>
+      <w:pPr>
+        <w:pStyle w:val="Listaconvietas"/>
+      </w:pPr>
+      <w:r>
+        <w:rPr>
+          <w:b/>
+        </w:rPr>
+        <w:t xml:space="preserve">Para qué sirve: </w:t>
+      </w:r>
+      <w:r>
+        <w:t xml:space="preserve">Confirmar qué cámara queda priorizada para la operación visible.</w:t>
+      </w:r>
+    </w:p>
+    <w:p>
+      <w:pPr>
+        <w:pStyle w:val="Listaconvietas"/>
+      </w:pPr>
+      <w:r>
+        <w:rPr>
+          <w:b/>
+        </w:rPr>
+        <w:t xml:space="preserve">Cuándo la usa: </w:t>
+      </w:r>
+      <w:r>
+        <w:t xml:space="preserve">Al ajustar reglas o al revisar la prioridad aplicada a un caso.</w:t>
+      </w:r>
+    </w:p>
+    <w:p>
+      <w:pPr>
+        <w:pStyle w:val="Listaconvietas"/>
+      </w:pPr>
+      <w:r>
+        <w:rPr>
+          <w:b/>
+        </w:rPr>
+        <w:t xml:space="preserve">Pasos funcionales: </w:t>
+      </w:r>
+      <w:r>
+        <w:t xml:space="preserve">Abrir la pantalla, comparar la cámara activa y validar el orden mostrado.</w:t>
+      </w:r>
+    </w:p>
+    <w:p>
+      <w:pPr>
+        <w:pStyle w:val="Listaconvietas"/>
+      </w:pPr>
+      <w:r>
+        <w:rPr>
+          <w:b/>
+        </w:rPr>
+        <w:t xml:space="preserve">Qué debe validar: </w:t>
+      </w:r>
+      <w:r>
+        <w:t xml:space="preserve">Que ACH Colombia y CENIT mantengan la prioridad esperada.</w:t>
+      </w:r>
+    </w:p>
+    <w:p>
+      <w:pPr>
+        <w:pStyle w:val="Listaconvietas"/>
+      </w:pPr>
+      <w:r>
+        <w:rPr>
+          <w:b/>
+        </w:rPr>
+        <w:t xml:space="preserve">Qué errores debe reportar: </w:t>
+      </w:r>
+      <w:r>
+        <w:t xml:space="preserve">Reportar prioridad invertida, falta de cámara o cambios no previstos.</w:t>
+      </w:r>
+    </w:p>
+    <w:p>
+      <w:pPr>
+        <w:pStyle w:val="Listaconvietas"/>
+      </w:pPr>
+      <w:r>
+        <w:rPr>
+          <w:b/>
+        </w:rPr>
+        <w:t xml:space="preserve">Captura asociada: </w:t>
+      </w:r>
+      <w:r>
+        <w:t xml:space="preserve">33_clearing_house_preferences_prioridades_camara.png</w:t>
+      </w:r>
+    </w:p>
+    <w:p>
+      <w:pPr>
+        <w:pStyle w:val="Ttulo2"/>
+      </w:pPr>
+      <w:r>
+        <w:t xml:space="preserve">35.8 Tipos de documento, género y persona</w:t>
+      </w:r>
+    </w:p>
+    <w:p>
+      <w:pPr>
+        <w:pStyle w:val="Normal"/>
+      </w:pPr>
+      <w:r>
+        <w:t xml:space="preserve">Agrupa los catálogos que soportan la clasificación básica de personas y documentos.</w:t>
+      </w:r>
+    </w:p>
+    <w:p>
+      <w:pPr>
+        <w:pStyle w:val="Listaconvietas"/>
+      </w:pPr>
+      <w:r>
+        <w:rPr>
+          <w:b/>
+        </w:rPr>
+        <w:t xml:space="preserve">Actor principal: </w:t>
+      </w:r>
+      <w:r>
+        <w:t xml:space="preserve">Administrador de catálogos / parametrización</w:t>
+      </w:r>
+    </w:p>
+    <w:p>
+      <w:pPr>
+        <w:pStyle w:val="Listaconvietas"/>
+      </w:pPr>
+      <w:r>
+        <w:rPr>
+          <w:b/>
+        </w:rPr>
+        <w:t xml:space="preserve">Actores secundarios: </w:t>
+      </w:r>
+      <w:r>
+        <w:t xml:space="preserve">Operador ACH</w:t>
+      </w:r>
+    </w:p>
+    <w:p>
+      <w:pPr>
+        <w:pStyle w:val="Listaconvietas"/>
+      </w:pPr>
+      <w:r>
+        <w:rPr>
+          <w:b/>
+        </w:rPr>
+        <w:t xml:space="preserve">Para qué sirve: </w:t>
+      </w:r>
+      <w:r>
+        <w:t xml:space="preserve">Mantener catálogos maestros visibles y consistentes para las altas.</w:t>
+      </w:r>
+    </w:p>
+    <w:p>
+      <w:pPr>
+        <w:pStyle w:val="Listaconvietas"/>
+      </w:pPr>
+      <w:r>
+        <w:rPr>
+          <w:b/>
+        </w:rPr>
+        <w:t xml:space="preserve">Cuándo la usa: </w:t>
+      </w:r>
+      <w:r>
+        <w:t xml:space="preserve">Antes de crear o editar clientes y terceros.</w:t>
+      </w:r>
+    </w:p>
+    <w:p>
+      <w:pPr>
+        <w:pStyle w:val="Listaconvietas"/>
+      </w:pPr>
+      <w:r>
+        <w:rPr>
+          <w:b/>
+        </w:rPr>
+        <w:t xml:space="preserve">Pasos funcionales: </w:t>
+      </w:r>
+      <w:r>
+        <w:t xml:space="preserve">Revisar cada catálogo, confirmar que el valor exista y verificar su estado visible.</w:t>
+      </w:r>
+    </w:p>
+    <w:p>
+      <w:pPr>
+        <w:pStyle w:val="Listaconvietas"/>
+      </w:pPr>
+      <w:r>
+        <w:rPr>
+          <w:b/>
+        </w:rPr>
+        <w:t xml:space="preserve">Qué debe validar: </w:t>
+      </w:r>
+      <w:r>
+        <w:t xml:space="preserve">Que los catálogos permitan seleccionar el valor correcto sin ambigüedad.</w:t>
+      </w:r>
+    </w:p>
+    <w:p>
+      <w:pPr>
+        <w:pStyle w:val="Listaconvietas"/>
+      </w:pPr>
+      <w:r>
+        <w:rPr>
+          <w:b/>
+        </w:rPr>
+        <w:t xml:space="preserve">Qué errores debe reportar: </w:t>
+      </w:r>
+      <w:r>
+        <w:t xml:space="preserve">Reportar catálogos vacíos, textos incorrectos o valores que no aparezcan.</w:t>
+      </w:r>
+    </w:p>
+    <w:p>
+      <w:pPr>
+        <w:pStyle w:val="Listaconvietas"/>
+      </w:pPr>
+      <w:r>
+        <w:rPr>
+          <w:b/>
+        </w:rPr>
+        <w:t xml:space="preserve">Captura asociada: </w:t>
+      </w:r>
+      <w:r>
+        <w:t xml:space="preserve">34_catalog_document_types.png; 35_catalog_gender_types.png; 36_catalog_person_types.png</w:t>
+      </w:r>
+    </w:p>
+    <w:p>
+      <w:pPr>
+        <w:pStyle w:val="Ttulo2"/>
+      </w:pPr>
+      <w:r>
+        <w:t xml:space="preserve">35.9 Tipos o códigos de transacción ACH</w:t>
+      </w:r>
+    </w:p>
+    <w:p>
+      <w:pPr>
+        <w:pStyle w:val="Normal"/>
+      </w:pPr>
+      <w:r>
+        <w:t xml:space="preserve">Describe el catálogo que define la clasificación de la transacción ACH.</w:t>
+      </w:r>
+    </w:p>
+    <w:p>
+      <w:pPr>
+        <w:pStyle w:val="Listaconvietas"/>
+      </w:pPr>
+      <w:r>
+        <w:rPr>
+          <w:b/>
+        </w:rPr>
+        <w:t xml:space="preserve">Actor principal: </w:t>
+      </w:r>
+      <w:r>
+        <w:t xml:space="preserve">Administrador de catálogos / parametrización</w:t>
+      </w:r>
+    </w:p>
+    <w:p>
+      <w:pPr>
+        <w:pStyle w:val="Listaconvietas"/>
+      </w:pPr>
+      <w:r>
+        <w:rPr>
+          <w:b/>
+        </w:rPr>
+        <w:t xml:space="preserve">Actores secundarios: </w:t>
+      </w:r>
+      <w:r>
+        <w:t xml:space="preserve">Administrador funcional ACH</w:t>
+      </w:r>
+    </w:p>
+    <w:p>
+      <w:pPr>
+        <w:pStyle w:val="Listaconvietas"/>
+      </w:pPr>
+      <w:r>
+        <w:rPr>
+          <w:b/>
+        </w:rPr>
+        <w:t xml:space="preserve">Para qué sirve: </w:t>
+      </w:r>
+      <w:r>
+        <w:t xml:space="preserve">Asegurar que el código funcional correcto esté disponible en pantalla.</w:t>
+      </w:r>
+    </w:p>
+    <w:p>
+      <w:pPr>
+        <w:pStyle w:val="Listaconvietas"/>
+      </w:pPr>
+      <w:r>
+        <w:rPr>
+          <w:b/>
+        </w:rPr>
+        <w:t xml:space="preserve">Cuándo la usa: </w:t>
+      </w:r>
+      <w:r>
+        <w:t xml:space="preserve">Al preparar reglas, lotes o transacciones para una prueba.</w:t>
+      </w:r>
+    </w:p>
+    <w:p>
+      <w:pPr>
+        <w:pStyle w:val="Listaconvietas"/>
+      </w:pPr>
+      <w:r>
+        <w:rPr>
+          <w:b/>
+        </w:rPr>
+        <w:t xml:space="preserve">Pasos funcionales: </w:t>
+      </w:r>
+      <w:r>
+        <w:t xml:space="preserve">Abrir el catálogo, ubicar el código y revisar su vigencia o estado visible.</w:t>
+      </w:r>
+    </w:p>
+    <w:p>
+      <w:pPr>
+        <w:pStyle w:val="Listaconvietas"/>
+      </w:pPr>
+      <w:r>
+        <w:rPr>
+          <w:b/>
+        </w:rPr>
+        <w:t xml:space="preserve">Qué debe validar: </w:t>
+      </w:r>
+      <w:r>
+        <w:t xml:space="preserve">Que el código corresponda al escenario de prueba y se pueda consultar.</w:t>
+      </w:r>
+    </w:p>
+    <w:p>
+      <w:pPr>
+        <w:pStyle w:val="Listaconvietas"/>
+      </w:pPr>
+      <w:r>
+        <w:rPr>
+          <w:b/>
+        </w:rPr>
+        <w:t xml:space="preserve">Qué errores debe reportar: </w:t>
+      </w:r>
+      <w:r>
+        <w:t xml:space="preserve">Reportar códigos faltantes, descripciones erradas o estados incorrectos.</w:t>
+      </w:r>
+    </w:p>
+    <w:p>
+      <w:pPr>
+        <w:pStyle w:val="Listaconvietas"/>
+      </w:pPr>
+      <w:r>
+        <w:rPr>
+          <w:b/>
+        </w:rPr>
+        <w:t xml:space="preserve">Captura asociada: </w:t>
+      </w:r>
+      <w:r>
+        <w:t xml:space="preserve">37_catalog_transaction_codes.png</w:t>
+      </w:r>
+    </w:p>
+    <w:p>
+      <w:pPr>
+        <w:pStyle w:val="Ttulo2"/>
+      </w:pPr>
+      <w:r>
+        <w:t xml:space="preserve">35.10 Conceptos de lote</w:t>
+      </w:r>
+    </w:p>
+    <w:p>
+      <w:pPr>
+        <w:pStyle w:val="Normal"/>
+      </w:pPr>
+      <w:r>
+        <w:t xml:space="preserve">Permite revisar los conceptos de lote utilizados en la operación.</w:t>
+      </w:r>
+    </w:p>
+    <w:p>
+      <w:pPr>
+        <w:pStyle w:val="Listaconvietas"/>
+      </w:pPr>
+      <w:r>
+        <w:rPr>
+          <w:b/>
+        </w:rPr>
+        <w:t xml:space="preserve">Actor principal: </w:t>
+      </w:r>
+      <w:r>
+        <w:t xml:space="preserve">Administrador de catálogos / parametrización</w:t>
+      </w:r>
+    </w:p>
+    <w:p>
+      <w:pPr>
+        <w:pStyle w:val="Listaconvietas"/>
+      </w:pPr>
+      <w:r>
+        <w:rPr>
+          <w:b/>
+        </w:rPr>
+        <w:t xml:space="preserve">Actores secundarios: </w:t>
+      </w:r>
+      <w:r>
+        <w:t xml:space="preserve">Operador ACH</w:t>
+      </w:r>
+    </w:p>
+    <w:p>
+      <w:pPr>
+        <w:pStyle w:val="Listaconvietas"/>
+      </w:pPr>
+      <w:r>
+        <w:rPr>
+          <w:b/>
+        </w:rPr>
+        <w:t xml:space="preserve">Para qué sirve: </w:t>
+      </w:r>
+      <w:r>
+        <w:t xml:space="preserve">Identificar el concepto visible que se aplicará en el lote.</w:t>
+      </w:r>
+    </w:p>
+    <w:p>
+      <w:pPr>
+        <w:pStyle w:val="Listaconvietas"/>
+      </w:pPr>
+      <w:r>
+        <w:rPr>
+          <w:b/>
+        </w:rPr>
+        <w:t xml:space="preserve">Cuándo la usa: </w:t>
+      </w:r>
+      <w:r>
+        <w:t xml:space="preserve">Durante la preparación de transacciones o ciclos.</w:t>
+      </w:r>
+    </w:p>
+    <w:p>
+      <w:pPr>
+        <w:pStyle w:val="Listaconvietas"/>
+      </w:pPr>
+      <w:r>
+        <w:rPr>
+          <w:b/>
+        </w:rPr>
+        <w:t xml:space="preserve">Pasos funcionales: </w:t>
+      </w:r>
+      <w:r>
+        <w:t xml:space="preserve">Abrir el catálogo, validar el concepto mostrado y confirmar su uso funcional.</w:t>
+      </w:r>
+    </w:p>
+    <w:p>
+      <w:pPr>
+        <w:pStyle w:val="Listaconvietas"/>
+      </w:pPr>
+      <w:r>
+        <w:rPr>
+          <w:b/>
+        </w:rPr>
+        <w:t xml:space="preserve">Qué debe validar: </w:t>
+      </w:r>
+      <w:r>
+        <w:t xml:space="preserve">Que el concepto corresponda al lote del caso de prueba.</w:t>
+      </w:r>
+    </w:p>
+    <w:p>
+      <w:pPr>
+        <w:pStyle w:val="Listaconvietas"/>
+      </w:pPr>
+      <w:r>
+        <w:rPr>
+          <w:b/>
+        </w:rPr>
+        <w:t xml:space="preserve">Qué errores debe reportar: </w:t>
+      </w:r>
+      <w:r>
+        <w:t xml:space="preserve">Reportar conceptos incorrectos, vacíos o no disponibles.</w:t>
+      </w:r>
+    </w:p>
+    <w:p>
+      <w:pPr>
+        <w:pStyle w:val="Listaconvietas"/>
+      </w:pPr>
+      <w:r>
+        <w:rPr>
+          <w:b/>
+        </w:rPr>
+        <w:t xml:space="preserve">Captura asociada: </w:t>
+      </w:r>
+      <w:r>
+        <w:t xml:space="preserve">38_catalog_company_entry_descriptions.png</w:t>
+      </w:r>
+    </w:p>
+    <w:p>
+      <w:pPr>
+        <w:pStyle w:val="Ttulo2"/>
+      </w:pPr>
+      <w:r>
+        <w:t xml:space="preserve">35.11 Reglas por cámara</w:t>
+      </w:r>
+    </w:p>
+    <w:p>
+      <w:pPr>
+        <w:pStyle w:val="Normal"/>
+      </w:pPr>
+      <w:r>
+        <w:t xml:space="preserve">Centraliza la revisión de las reglas aplicadas por cámara.</w:t>
+      </w:r>
+    </w:p>
+    <w:p>
+      <w:pPr>
+        <w:pStyle w:val="Listaconvietas"/>
+      </w:pPr>
+      <w:r>
+        <w:rPr>
+          <w:b/>
+        </w:rPr>
+        <w:t xml:space="preserve">Actor principal: </w:t>
+      </w:r>
+      <w:r>
+        <w:t xml:space="preserve">Administrador funcional ACH</w:t>
+      </w:r>
+    </w:p>
+    <w:p>
+      <w:pPr>
+        <w:pStyle w:val="Listaconvietas"/>
+      </w:pPr>
+      <w:r>
+        <w:rPr>
+          <w:b/>
+        </w:rPr>
+        <w:t xml:space="preserve">Actores secundarios: </w:t>
+      </w:r>
+      <w:r>
+        <w:t xml:space="preserve">Operador ACH</w:t>
+      </w:r>
+    </w:p>
+    <w:p>
+      <w:pPr>
+        <w:pStyle w:val="Listaconvietas"/>
+      </w:pPr>
+      <w:r>
+        <w:rPr>
+          <w:b/>
+        </w:rPr>
+        <w:t xml:space="preserve">Para qué sirve: </w:t>
+      </w:r>
+      <w:r>
+        <w:t xml:space="preserve">Validar el comportamiento regulatorio esperado por cámara.</w:t>
+      </w:r>
+    </w:p>
+    <w:p>
+      <w:pPr>
+        <w:pStyle w:val="Listaconvietas"/>
+      </w:pPr>
+      <w:r>
+        <w:rPr>
+          <w:b/>
+        </w:rPr>
+        <w:t xml:space="preserve">Cuándo la usa: </w:t>
+      </w:r>
+      <w:r>
+        <w:t xml:space="preserve">Antes de crear transacciones o de verificar un rechazo o devolución.</w:t>
+      </w:r>
+    </w:p>
+    <w:p>
+      <w:pPr>
+        <w:pStyle w:val="Listaconvietas"/>
+      </w:pPr>
+      <w:r>
+        <w:rPr>
+          <w:b/>
+        </w:rPr>
+        <w:t xml:space="preserve">Pasos funcionales: </w:t>
+      </w:r>
+      <w:r>
+        <w:t xml:space="preserve">Abrir la pantalla, revisar la regla visible y contrastarla con el caso.</w:t>
+      </w:r>
+    </w:p>
+    <w:p>
+      <w:pPr>
+        <w:pStyle w:val="Listaconvietas"/>
+      </w:pPr>
+      <w:r>
+        <w:rPr>
+          <w:b/>
+        </w:rPr>
+        <w:t xml:space="preserve">Qué debe validar: </w:t>
+      </w:r>
+      <w:r>
+        <w:t xml:space="preserve">Que la cámara y la regla coincidan con el flujo esperado.</w:t>
+      </w:r>
+    </w:p>
+    <w:p>
+      <w:pPr>
+        <w:pStyle w:val="Listaconvietas"/>
+      </w:pPr>
+      <w:r>
+        <w:rPr>
+          <w:b/>
+        </w:rPr>
+        <w:t xml:space="preserve">Qué errores debe reportar: </w:t>
+      </w:r>
+      <w:r>
+        <w:t xml:space="preserve">Reportar reglas ausentes, aplicadas a la cámara equivocada o sin coherencia.</w:t>
+      </w:r>
+    </w:p>
+    <w:p>
+      <w:pPr>
+        <w:pStyle w:val="Listaconvietas"/>
+      </w:pPr>
+      <w:r>
+        <w:rPr>
+          <w:b/>
+        </w:rPr>
+        <w:t xml:space="preserve">Captura asociada: </w:t>
+      </w:r>
+      <w:r>
+        <w:t xml:space="preserve">39_transactions_clearing_house_rules.png</w:t>
+      </w:r>
+    </w:p>
+    <w:p>
+      <w:pPr>
+        <w:pStyle w:val="Ttulo2"/>
+      </w:pPr>
+      <w:r>
+        <w:t xml:space="preserve">35.12 Configuración de ciclos</w:t>
+      </w:r>
+    </w:p>
+    <w:p>
+      <w:pPr>
+        <w:pStyle w:val="Normal"/>
+      </w:pPr>
+      <w:r>
+        <w:t xml:space="preserve">Resume la administración de ciclos usada por la operación.</w:t>
+      </w:r>
+    </w:p>
+    <w:p>
+      <w:pPr>
+        <w:pStyle w:val="Listaconvietas"/>
+      </w:pPr>
+      <w:r>
+        <w:rPr>
+          <w:b/>
+        </w:rPr>
+        <w:t xml:space="preserve">Actor principal: </w:t>
+      </w:r>
+      <w:r>
+        <w:t xml:space="preserve">Administrador funcional ACH</w:t>
+      </w:r>
+    </w:p>
+    <w:p>
+      <w:pPr>
+        <w:pStyle w:val="Listaconvietas"/>
+      </w:pPr>
+      <w:r>
+        <w:rPr>
+          <w:b/>
+        </w:rPr>
+        <w:t xml:space="preserve">Actores secundarios: </w:t>
+      </w:r>
+      <w:r>
+        <w:t xml:space="preserve">Operador ACH; Revisor / validador operativo</w:t>
+      </w:r>
+    </w:p>
+    <w:p>
+      <w:pPr>
+        <w:pStyle w:val="Listaconvietas"/>
+      </w:pPr>
+      <w:r>
+        <w:rPr>
+          <w:b/>
+        </w:rPr>
+        <w:t xml:space="preserve">Para qué sirve: </w:t>
+      </w:r>
+      <w:r>
+        <w:t xml:space="preserve">Revisar vigencias, versionado y disponibilidad de ciclo.</w:t>
+      </w:r>
+    </w:p>
+    <w:p>
+      <w:pPr>
+        <w:pStyle w:val="Listaconvietas"/>
+      </w:pPr>
+      <w:r>
+        <w:rPr>
+          <w:b/>
+        </w:rPr>
+        <w:t xml:space="preserve">Cuándo la usa: </w:t>
+      </w:r>
+      <w:r>
+        <w:t xml:space="preserve">Antes de exportar, conciliar o validar una transacción por ciclo.</w:t>
+      </w:r>
+    </w:p>
+    <w:p>
+      <w:pPr>
+        <w:pStyle w:val="Listaconvietas"/>
+      </w:pPr>
+      <w:r>
+        <w:rPr>
+          <w:b/>
+        </w:rPr>
+        <w:t xml:space="preserve">Pasos funcionales: </w:t>
+      </w:r>
+      <w:r>
+        <w:t xml:space="preserve">Abrir la configuración, ubicar el ciclo y confirmar su vigencia visible.</w:t>
+      </w:r>
+    </w:p>
+    <w:p>
+      <w:pPr>
+        <w:pStyle w:val="Listaconvietas"/>
+      </w:pPr>
+      <w:r>
+        <w:rPr>
+          <w:b/>
+        </w:rPr>
+        <w:t xml:space="preserve">Qué debe validar: </w:t>
+      </w:r>
+      <w:r>
+        <w:t xml:space="preserve">Que el ciclo esté activo para el escenario de prueba.</w:t>
+      </w:r>
+    </w:p>
+    <w:p>
+      <w:pPr>
+        <w:pStyle w:val="Listaconvietas"/>
+      </w:pPr>
+      <w:r>
+        <w:rPr>
+          <w:b/>
+        </w:rPr>
+        <w:t xml:space="preserve">Qué errores debe reportar: </w:t>
+      </w:r>
+      <w:r>
+        <w:t xml:space="preserve">Reportar ciclos deshabilitados, fechas inválidas o cambios inesperados.</w:t>
+      </w:r>
+    </w:p>
+    <w:p>
+      <w:pPr>
+        <w:pStyle w:val="Listaconvietas"/>
+      </w:pPr>
+      <w:r>
+        <w:rPr>
+          <w:b/>
+        </w:rPr>
+        <w:t xml:space="preserve">Captura asociada: </w:t>
+      </w:r>
+      <w:r>
+        <w:t xml:space="preserve">40_transactions_cycle_configs.png</w:t>
+      </w:r>
+    </w:p>
+    <w:p>
+      <w:pPr>
+        <w:pStyle w:val="Ttulo2"/>
+      </w:pPr>
+      <w:r>
+        <w:t xml:space="preserve">35.13 Causales de devolución y rechazo por cámara</w:t>
+      </w:r>
+    </w:p>
+    <w:p>
+      <w:pPr>
+        <w:pStyle w:val="Normal"/>
+      </w:pPr>
+      <w:r>
+        <w:t xml:space="preserve">Agrupa los catálogos regulatorios visibles para devoluciones y rechazos.</w:t>
+      </w:r>
+    </w:p>
+    <w:p>
+      <w:pPr>
+        <w:pStyle w:val="Listaconvietas"/>
+      </w:pPr>
+      <w:r>
+        <w:rPr>
+          <w:b/>
+        </w:rPr>
+        <w:t xml:space="preserve">Actor principal: </w:t>
+      </w:r>
+      <w:r>
+        <w:t xml:space="preserve">Administrador funcional ACH</w:t>
+      </w:r>
+    </w:p>
+    <w:p>
+      <w:pPr>
+        <w:pStyle w:val="Listaconvietas"/>
+      </w:pPr>
+      <w:r>
+        <w:rPr>
+          <w:b/>
+        </w:rPr>
+        <w:t xml:space="preserve">Actores secundarios: </w:t>
+      </w:r>
+      <w:r>
+        <w:t xml:space="preserve">Revisor / validador operativo</w:t>
+      </w:r>
+    </w:p>
+    <w:p>
+      <w:pPr>
+        <w:pStyle w:val="Listaconvietas"/>
+      </w:pPr>
+      <w:r>
+        <w:rPr>
+          <w:b/>
+        </w:rPr>
+        <w:t xml:space="preserve">Para qué sirve: </w:t>
+      </w:r>
+      <w:r>
+        <w:t xml:space="preserve">Consultar la causal correcta según la cámara y el caso.</w:t>
+      </w:r>
+    </w:p>
+    <w:p>
+      <w:pPr>
+        <w:pStyle w:val="Listaconvietas"/>
+      </w:pPr>
+      <w:r>
+        <w:rPr>
+          <w:b/>
+        </w:rPr>
+        <w:t xml:space="preserve">Cuándo la usa: </w:t>
+      </w:r>
+      <w:r>
+        <w:t xml:space="preserve">Al revisar una devolución o un rechazo y antes de registrar evidencia.</w:t>
+      </w:r>
+    </w:p>
+    <w:p>
+      <w:pPr>
+        <w:pStyle w:val="Listaconvietas"/>
+      </w:pPr>
+      <w:r>
+        <w:rPr>
+          <w:b/>
+        </w:rPr>
+        <w:t xml:space="preserve">Pasos funcionales: </w:t>
+      </w:r>
+      <w:r>
+        <w:t xml:space="preserve">Abrir cada causal, comparar su descripción y validar que corresponda al flujo.</w:t>
+      </w:r>
+    </w:p>
+    <w:p>
+      <w:pPr>
+        <w:pStyle w:val="Listaconvietas"/>
+      </w:pPr>
+      <w:r>
+        <w:rPr>
+          <w:b/>
+        </w:rPr>
+        <w:t xml:space="preserve">Qué debe validar: </w:t>
+      </w:r>
+      <w:r>
+        <w:t xml:space="preserve">Que la causal visible coincida con el evento observado.</w:t>
+      </w:r>
+    </w:p>
+    <w:p>
+      <w:pPr>
+        <w:pStyle w:val="Listaconvietas"/>
+      </w:pPr>
+      <w:r>
+        <w:rPr>
+          <w:b/>
+        </w:rPr>
+        <w:t xml:space="preserve">Qué errores debe reportar: </w:t>
+      </w:r>
+      <w:r>
+        <w:t xml:space="preserve">Reportar causal ausente, texto erróneo o clasificación incorrecta.</w:t>
+      </w:r>
+    </w:p>
+    <w:p>
+      <w:pPr>
+        <w:pStyle w:val="Listaconvietas"/>
+      </w:pPr>
+      <w:r>
+        <w:rPr>
+          <w:b/>
+        </w:rPr>
+        <w:t xml:space="preserve">Captura asociada: </w:t>
+      </w:r>
+      <w:r>
+        <w:t xml:space="preserve">41_cenit_causales_devolucion.png; 42_cenit_causales_rechazo.png</w:t>
+      </w:r>
+    </w:p>
+    <w:p>
+      <w:pPr>
+        <w:pStyle w:val="Ttulo2"/>
+      </w:pPr>
+      <w:r>
+        <w:t xml:space="preserve">35.14 Políticas CENIT</w:t>
+      </w:r>
+    </w:p>
+    <w:p>
+      <w:pPr>
+        <w:pStyle w:val="Normal"/>
+      </w:pPr>
+      <w:r>
+        <w:t xml:space="preserve">Consolida las políticas visibles de transacción y prenotificación de CENIT.</w:t>
+      </w:r>
+    </w:p>
+    <w:p>
+      <w:pPr>
+        <w:pStyle w:val="Listaconvietas"/>
+      </w:pPr>
+      <w:r>
+        <w:rPr>
+          <w:b/>
+        </w:rPr>
+        <w:t xml:space="preserve">Actor principal: </w:t>
+      </w:r>
+      <w:r>
+        <w:t xml:space="preserve">Administrador funcional ACH</w:t>
+      </w:r>
+    </w:p>
+    <w:p>
+      <w:pPr>
+        <w:pStyle w:val="Listaconvietas"/>
+      </w:pPr>
+      <w:r>
+        <w:rPr>
+          <w:b/>
+        </w:rPr>
+        <w:t xml:space="preserve">Actores secundarios: </w:t>
+      </w:r>
+      <w:r>
+        <w:t xml:space="preserve">Operador ACH</w:t>
+      </w:r>
+    </w:p>
+    <w:p>
+      <w:pPr>
+        <w:pStyle w:val="Listaconvietas"/>
+      </w:pPr>
+      <w:r>
+        <w:rPr>
+          <w:b/>
+        </w:rPr>
+        <w:t xml:space="preserve">Para qué sirve: </w:t>
+      </w:r>
+      <w:r>
+        <w:t xml:space="preserve">Confirmar el criterio funcional que rige el caso de prueba.</w:t>
+      </w:r>
+    </w:p>
+    <w:p>
+      <w:pPr>
+        <w:pStyle w:val="Listaconvietas"/>
+      </w:pPr>
+      <w:r>
+        <w:rPr>
+          <w:b/>
+        </w:rPr>
+        <w:t xml:space="preserve">Cuándo la usa: </w:t>
+      </w:r>
+      <w:r>
+        <w:t xml:space="preserve">Antes de ejecutar un escenario que dependa de política CENIT.</w:t>
+      </w:r>
+    </w:p>
+    <w:p>
+      <w:pPr>
+        <w:pStyle w:val="Listaconvietas"/>
+      </w:pPr>
+      <w:r>
+        <w:rPr>
+          <w:b/>
+        </w:rPr>
+        <w:t xml:space="preserve">Pasos funcionales: </w:t>
+      </w:r>
+      <w:r>
+        <w:t xml:space="preserve">Abrir la política, revisar la regla y confirmar si aplica al escenario.</w:t>
+      </w:r>
+    </w:p>
+    <w:p>
+      <w:pPr>
+        <w:pStyle w:val="Listaconvietas"/>
+      </w:pPr>
+      <w:r>
+        <w:rPr>
+          <w:b/>
+        </w:rPr>
+        <w:t xml:space="preserve">Qué debe validar: </w:t>
+      </w:r>
+      <w:r>
+        <w:t xml:space="preserve">Que la política mostrada sea la correcta para la cámara.</w:t>
+      </w:r>
+    </w:p>
+    <w:p>
+      <w:pPr>
+        <w:pStyle w:val="Listaconvietas"/>
+      </w:pPr>
+      <w:r>
+        <w:rPr>
+          <w:b/>
+        </w:rPr>
+        <w:t xml:space="preserve">Qué errores debe reportar: </w:t>
+      </w:r>
+      <w:r>
+        <w:t xml:space="preserve">Reportar política faltante, inconsistente o no aplicable.</w:t>
+      </w:r>
+    </w:p>
+    <w:p>
+      <w:pPr>
+        <w:pStyle w:val="Listaconvietas"/>
+      </w:pPr>
+      <w:r>
+        <w:rPr>
+          <w:b/>
+        </w:rPr>
+        <w:t xml:space="preserve">Captura asociada: </w:t>
+      </w:r>
+      <w:r>
+        <w:t xml:space="preserve">43_cenit_politicas_transaccion.png; 44_cenit_politicas_prenotificacion.png</w:t>
+      </w:r>
+    </w:p>
+    <w:p>
+      <w:pPr>
+        <w:pStyle w:val="Ttulo2"/>
+      </w:pPr>
+      <w:r>
+        <w:t xml:space="preserve">35.15 Perfiles NACHA-M</w:t>
+      </w:r>
+    </w:p>
+    <w:p>
+      <w:pPr>
+        <w:pStyle w:val="Normal"/>
+      </w:pPr>
+      <w:r>
+        <w:t xml:space="preserve">Agrupa la administración de perfiles oficiales NACHA-M por cámara.</w:t>
+      </w:r>
+    </w:p>
+    <w:p>
+      <w:pPr>
+        <w:pStyle w:val="Listaconvietas"/>
+      </w:pPr>
+      <w:r>
+        <w:rPr>
+          <w:b/>
+        </w:rPr>
+        <w:t xml:space="preserve">Actor principal: </w:t>
+      </w:r>
+      <w:r>
+        <w:t xml:space="preserve">Administrador funcional ACH</w:t>
+      </w:r>
+    </w:p>
+    <w:p>
+      <w:pPr>
+        <w:pStyle w:val="Listaconvietas"/>
+      </w:pPr>
+      <w:r>
+        <w:rPr>
+          <w:b/>
+        </w:rPr>
+        <w:t xml:space="preserve">Actores secundarios: </w:t>
+      </w:r>
+      <w:r>
+        <w:t xml:space="preserve">Operador ACH</w:t>
+      </w:r>
+    </w:p>
+    <w:p>
+      <w:pPr>
+        <w:pStyle w:val="Listaconvietas"/>
+      </w:pPr>
+      <w:r>
+        <w:rPr>
+          <w:b/>
+        </w:rPr>
+        <w:t xml:space="preserve">Para qué sirve: </w:t>
+      </w:r>
+      <w:r>
+        <w:t xml:space="preserve">Consultar perfiles, versión y estado visible del perfil.</w:t>
+      </w:r>
+    </w:p>
+    <w:p>
+      <w:pPr>
+        <w:pStyle w:val="Listaconvietas"/>
+      </w:pPr>
+      <w:r>
+        <w:rPr>
+          <w:b/>
+        </w:rPr>
+        <w:t xml:space="preserve">Cuándo la usa: </w:t>
+      </w:r>
+      <w:r>
+        <w:t xml:space="preserve">Al preparar generación, exportación o validación operativa.</w:t>
+      </w:r>
+    </w:p>
+    <w:p>
+      <w:pPr>
+        <w:pStyle w:val="Listaconvietas"/>
+      </w:pPr>
+      <w:r>
+        <w:rPr>
+          <w:b/>
+        </w:rPr>
+        <w:t xml:space="preserve">Pasos funcionales: </w:t>
+      </w:r>
+      <w:r>
+        <w:t xml:space="preserve">Abrir el listado, entrar al perfil y revisar su detalle si existe registro.</w:t>
+      </w:r>
+    </w:p>
+    <w:p>
+      <w:pPr>
+        <w:pStyle w:val="Listaconvietas"/>
+      </w:pPr>
+      <w:r>
+        <w:rPr>
+          <w:b/>
+        </w:rPr>
+        <w:t xml:space="preserve">Qué debe validar: </w:t>
+      </w:r>
+      <w:r>
+        <w:t xml:space="preserve">Que el perfil corresponda a la cámara y a la versión esperada.</w:t>
+      </w:r>
+    </w:p>
+    <w:p>
+      <w:pPr>
+        <w:pStyle w:val="Listaconvietas"/>
+      </w:pPr>
+      <w:r>
+        <w:rPr>
+          <w:b/>
+        </w:rPr>
+        <w:t xml:space="preserve">Qué errores debe reportar: </w:t>
+      </w:r>
+      <w:r>
+        <w:t xml:space="preserve">Reportar perfil ausente, versión errada o detalle no navegable.</w:t>
+      </w:r>
+    </w:p>
+    <w:p>
+      <w:pPr>
+        <w:pStyle w:val="Listaconvietas"/>
+      </w:pPr>
+      <w:r>
+        <w:rPr>
+          <w:b/>
+        </w:rPr>
+        <w:t xml:space="preserve">Captura asociada: </w:t>
+      </w:r>
+      <w:r>
+        <w:t xml:space="preserve">45_nacha_config_perfiles.png; 46_nacha_config_perfil_detalle_si_existe.png</w:t>
+      </w:r>
+    </w:p>
+    <w:p>
+      <w:pPr>
+        <w:pStyle w:val="Ttulo2"/>
+      </w:pPr>
+      <w:r>
+        <w:t xml:space="preserve">35.16 Conciliación y reportes de rechazo</w:t>
+      </w:r>
+    </w:p>
+    <w:p>
+      <w:pPr>
+        <w:pStyle w:val="Normal"/>
+      </w:pPr>
+      <w:r>
+        <w:t xml:space="preserve">Reúne la consola de conciliación y el reporte de rechazos para validar resultados.</w:t>
+      </w:r>
+    </w:p>
+    <w:p>
+      <w:pPr>
+        <w:pStyle w:val="Listaconvietas"/>
+      </w:pPr>
+      <w:r>
+        <w:rPr>
+          <w:b/>
+        </w:rPr>
+        <w:t xml:space="preserve">Actor principal: </w:t>
+      </w:r>
+      <w:r>
+        <w:t xml:space="preserve">Revisor / validador operativo</w:t>
+      </w:r>
+    </w:p>
+    <w:p>
+      <w:pPr>
+        <w:pStyle w:val="Listaconvietas"/>
+      </w:pPr>
+      <w:r>
+        <w:rPr>
+          <w:b/>
+        </w:rPr>
+        <w:t xml:space="preserve">Actores secundarios: </w:t>
+      </w:r>
+      <w:r>
+        <w:t xml:space="preserve">Operador ACH; Usuario funcional de pruebas</w:t>
+      </w:r>
+    </w:p>
+    <w:p>
+      <w:pPr>
+        <w:pStyle w:val="Listaconvietas"/>
+      </w:pPr>
+      <w:r>
+        <w:rPr>
+          <w:b/>
+        </w:rPr>
+        <w:t xml:space="preserve">Para qué sirve: </w:t>
+      </w:r>
+      <w:r>
+        <w:t xml:space="preserve">Cruzar resultados, diferencias y rechazos visibles en la operación.</w:t>
+      </w:r>
+    </w:p>
+    <w:p>
+      <w:pPr>
+        <w:pStyle w:val="Listaconvietas"/>
+      </w:pPr>
+      <w:r>
+        <w:rPr>
+          <w:b/>
+        </w:rPr>
+        <w:t xml:space="preserve">Cuándo la usa: </w:t>
+      </w:r>
+      <w:r>
+        <w:t xml:space="preserve">Al cerrar una prueba o al revisar incidencias funcionales.</w:t>
+      </w:r>
+    </w:p>
+    <w:p>
+      <w:pPr>
+        <w:pStyle w:val="Listaconvietas"/>
+      </w:pPr>
+      <w:r>
+        <w:rPr>
+          <w:b/>
+        </w:rPr>
+        <w:t xml:space="preserve">Pasos funcionales: </w:t>
+      </w:r>
+      <w:r>
+        <w:t xml:space="preserve">Abrir conciliación, revisar diferencias y luego contrastar el reporte de rechazos.</w:t>
+      </w:r>
+    </w:p>
+    <w:p>
+      <w:pPr>
+        <w:pStyle w:val="Listaconvietas"/>
+      </w:pPr>
+      <w:r>
+        <w:rPr>
+          <w:b/>
+        </w:rPr>
+        <w:t xml:space="preserve">Qué debe validar: </w:t>
+      </w:r>
+      <w:r>
+        <w:t xml:space="preserve">Que los resultados coincidan con el caso de prueba y su evidencia.</w:t>
+      </w:r>
+    </w:p>
+    <w:p>
+      <w:pPr>
+        <w:pStyle w:val="Listaconvietas"/>
+      </w:pPr>
+      <w:r>
+        <w:rPr>
+          <w:b/>
+        </w:rPr>
+        <w:t xml:space="preserve">Qué errores debe reportar: </w:t>
+      </w:r>
+      <w:r>
+        <w:t xml:space="preserve">Reportar diferencias no explicadas, faltantes de rechazo o estados inconsistentes.</w:t>
+      </w:r>
+    </w:p>
+    <w:p>
+      <w:pPr>
+        <w:pStyle w:val="Listaconvietas"/>
+      </w:pPr>
+      <w:r>
+        <w:rPr>
+          <w:b/>
+        </w:rPr>
+        <w:t xml:space="preserve">Captura asociada: </w:t>
+      </w:r>
+      <w:r>
+        <w:t xml:space="preserve">47_nacha_operational_dashboard.png; 48_ach_reconciliation.png; 49_reports_rejections.png</w:t>
+      </w:r>
+    </w:p>
+    <w:p>
+      <w:pPr>
+        <w:pStyle w:val="Ttulo2"/>
+      </w:pPr>
+      <w:r>
+        <w:t xml:space="preserve">35.17 Dígito de verificación, si existe</w:t>
+      </w:r>
+    </w:p>
+    <w:p>
+      <w:pPr>
+        <w:pStyle w:val="Normal"/>
+      </w:pPr>
+      <w:r>
+        <w:t xml:space="preserve">Muestra el valor visible del dígito solo cuando la pantalla lo presenta.</w:t>
+      </w:r>
+    </w:p>
+    <w:p>
+      <w:pPr>
+        <w:pStyle w:val="Listaconvietas"/>
+      </w:pPr>
+      <w:r>
+        <w:rPr>
+          <w:b/>
+        </w:rPr>
+        <w:t xml:space="preserve">Actor principal: </w:t>
+      </w:r>
+      <w:r>
+        <w:t xml:space="preserve">Administrador de catálogos / parametrización</w:t>
+      </w:r>
+    </w:p>
+    <w:p>
+      <w:pPr>
+        <w:pStyle w:val="Listaconvietas"/>
+      </w:pPr>
+      <w:r>
+        <w:rPr>
+          <w:b/>
+        </w:rPr>
+        <w:t xml:space="preserve">Actores secundarios: </w:t>
+      </w:r>
+      <w:r>
+        <w:t xml:space="preserve">Operador ACH</w:t>
+      </w:r>
+    </w:p>
+    <w:p>
+      <w:pPr>
+        <w:pStyle w:val="Listaconvietas"/>
+      </w:pPr>
+      <w:r>
+        <w:rPr>
+          <w:b/>
+        </w:rPr>
+        <w:t xml:space="preserve">Para qué sirve: </w:t>
+      </w:r>
+      <w:r>
+        <w:t xml:space="preserve">Validar que el dato visible coincida con la entidad financiera mostrada.</w:t>
+      </w:r>
+    </w:p>
+    <w:p>
+      <w:pPr>
+        <w:pStyle w:val="Listaconvietas"/>
+      </w:pPr>
+      <w:r>
+        <w:rPr>
+          <w:b/>
+        </w:rPr>
+        <w:t xml:space="preserve">Cuándo la usa: </w:t>
+      </w:r>
+      <w:r>
+        <w:t xml:space="preserve">Al revisar la entidad financiera o el alta que exponga ese valor.</w:t>
+      </w:r>
+    </w:p>
+    <w:p>
+      <w:pPr>
+        <w:pStyle w:val="Listaconvietas"/>
+      </w:pPr>
+      <w:r>
+        <w:rPr>
+          <w:b/>
+        </w:rPr>
+        <w:t xml:space="preserve">Pasos funcionales: </w:t>
+      </w:r>
+      <w:r>
+        <w:t xml:space="preserve">Abrir la pantalla y confirmar si el dígito aparece como campo visible.</w:t>
+      </w:r>
+    </w:p>
+    <w:p>
+      <w:pPr>
+        <w:pStyle w:val="Listaconvietas"/>
+      </w:pPr>
+      <w:r>
+        <w:rPr>
+          <w:b/>
+        </w:rPr>
+        <w:t xml:space="preserve">Qué debe validar: </w:t>
+      </w:r>
+      <w:r>
+        <w:t xml:space="preserve">Que el valor mostrado sea consistente con la entidad y el formulario.</w:t>
+      </w:r>
+    </w:p>
+    <w:p>
+      <w:pPr>
+        <w:pStyle w:val="Listaconvietas"/>
+      </w:pPr>
+      <w:r>
+        <w:rPr>
+          <w:b/>
+        </w:rPr>
+        <w:t xml:space="preserve">Qué errores debe reportar: </w:t>
+      </w:r>
+      <w:r>
+        <w:t xml:space="preserve">Reportar si el campo no aparece, si está vacío o si el dato es inconsistente.</w:t>
+      </w:r>
+    </w:p>
+    <w:p>
+      <w:pPr>
+        <w:pStyle w:val="Listaconvietas"/>
+      </w:pPr>
+      <w:r>
+        <w:rPr>
+          <w:b/>
+        </w:rPr>
+        <w:t xml:space="preserve">Captura asociada: </w:t>
+      </w:r>
+      <w:r>
+        <w:t xml:space="preserve">32_financial_institutions_mantenimiento_digito_verificacion.png</w:t>
+      </w:r>
+    </w:p>
+    <w:p>
+      <w:pPr>
+        <w:pStyle w:val="Ttulo2"/>
+      </w:pPr>
+      <w:r>
+        <w:t xml:space="preserve">35.18 Seguridad NACHA-M, certificados digitales y sobre digital</w:t>
+      </w:r>
+    </w:p>
+    <w:p>
+      <w:pPr>
+        <w:pStyle w:val="Normal"/>
+      </w:pPr>
+      <w:r>
+        <w:t xml:space="preserve">Agrupa el panel de seguridad y las operaciones visibles sobre el sobre digital.</w:t>
+      </w:r>
+    </w:p>
+    <w:p>
+      <w:pPr>
+        <w:pStyle w:val="Listaconvietas"/>
+      </w:pPr>
+      <w:r>
+        <w:rPr>
+          <w:b/>
+        </w:rPr>
+        <w:t xml:space="preserve">Actor principal: </w:t>
+      </w:r>
+      <w:r>
+        <w:t xml:space="preserve">Administrador de certificados digitales</w:t>
+      </w:r>
+    </w:p>
+    <w:p>
+      <w:pPr>
+        <w:pStyle w:val="Listaconvietas"/>
+      </w:pPr>
+      <w:r>
+        <w:rPr>
+          <w:b/>
+        </w:rPr>
+        <w:t xml:space="preserve">Actores secundarios: </w:t>
+      </w:r>
+      <w:r>
+        <w:t xml:space="preserve">Soporte técnico funcional; Revisor / validador operativo</w:t>
+      </w:r>
+    </w:p>
+    <w:p>
+      <w:pPr>
+        <w:pStyle w:val="Listaconvietas"/>
+      </w:pPr>
+      <w:r>
+        <w:rPr>
+          <w:b/>
+        </w:rPr>
+        <w:t xml:space="preserve">Para qué sirve: </w:t>
+      </w:r>
+      <w:r>
+        <w:t xml:space="preserve">Administrar la operación visible de generación, cifrado, descifrado y auditoría.</w:t>
+      </w:r>
+    </w:p>
+    <w:p>
+      <w:pPr>
+        <w:pStyle w:val="Listaconvietas"/>
+      </w:pPr>
+      <w:r>
+        <w:rPr>
+          <w:b/>
+        </w:rPr>
+        <w:t xml:space="preserve">Cuándo la usa: </w:t>
+      </w:r>
+      <w:r>
+        <w:t xml:space="preserve">Durante pruebas de seguridad funcional o revisión de evidencias.</w:t>
+      </w:r>
+    </w:p>
+    <w:p>
+      <w:pPr>
+        <w:pStyle w:val="Listaconvietas"/>
+      </w:pPr>
+      <w:r>
+        <w:rPr>
+          <w:b/>
+        </w:rPr>
+        <w:t xml:space="preserve">Pasos funcionales: </w:t>
+      </w:r>
+      <w:r>
+        <w:t xml:space="preserve">Abrir el panel, entrar a la operación requerida y revisar el resultado visible.</w:t>
+      </w:r>
+    </w:p>
+    <w:p>
+      <w:pPr>
+        <w:pStyle w:val="Listaconvietas"/>
+      </w:pPr>
+      <w:r>
+        <w:rPr>
+          <w:b/>
+        </w:rPr>
+        <w:t xml:space="preserve">Qué debe validar: </w:t>
+      </w:r>
+      <w:r>
+        <w:t xml:space="preserve">Que la operación muestre el archivo esperado y no exponga datos sensibles.</w:t>
+      </w:r>
+    </w:p>
+    <w:p>
+      <w:pPr>
+        <w:pStyle w:val="Listaconvietas"/>
+      </w:pPr>
+      <w:r>
+        <w:rPr>
+          <w:b/>
+        </w:rPr>
+        <w:t xml:space="preserve">Qué errores debe reportar: </w:t>
+      </w:r>
+      <w:r>
+        <w:t xml:space="preserve">Reportar fallas de carga, mensajes ambiguos o exposición de información sensible.</w:t>
+      </w:r>
+    </w:p>
+    <w:p>
+      <w:pPr>
+        <w:pStyle w:val="Listaconvietas"/>
+      </w:pPr>
+      <w:r>
+        <w:rPr>
+          <w:b/>
+        </w:rPr>
+        <w:t xml:space="preserve">Captura asociada: </w:t>
+      </w:r>
+      <w:r>
+        <w:t xml:space="preserve">51_nacha_security_dashboard.png; 56_nacha_security_audit_sobre_digital.png; 59_nacha_manual_encrypt_sobre_digital.png; 60_nacha_manual_decrypt_sobre_digital.png; 61_sobre_digital_tool.png; 62_interoperabilidad_vector_oficial.png</w:t>
+      </w:r>
+    </w:p>
+    <w:p>
+      <w:pPr>
+        <w:pStyle w:val="Ttulo2"/>
+      </w:pPr>
+      <w:r>
+        <w:t xml:space="preserve">35.19 Gobierno de certificados digitales</w:t>
+      </w:r>
+    </w:p>
+    <w:p>
+      <w:pPr>
+        <w:pStyle w:val="Normal"/>
+      </w:pPr>
+      <w:r>
+        <w:t xml:space="preserve">Centraliza la consulta, versionado, estados y control visible de certificados.</w:t>
+      </w:r>
+    </w:p>
+    <w:p>
+      <w:pPr>
+        <w:pStyle w:val="Listaconvietas"/>
+      </w:pPr>
+      <w:r>
+        <w:rPr>
+          <w:b/>
+        </w:rPr>
+        <w:t xml:space="preserve">Actor principal: </w:t>
+      </w:r>
+      <w:r>
+        <w:t xml:space="preserve">Administrador de certificados digitales</w:t>
+      </w:r>
+    </w:p>
+    <w:p>
+      <w:pPr>
+        <w:pStyle w:val="Listaconvietas"/>
+      </w:pPr>
+      <w:r>
+        <w:rPr>
+          <w:b/>
+        </w:rPr>
+        <w:t xml:space="preserve">Actores secundarios: </w:t>
+      </w:r>
+      <w:r>
+        <w:t xml:space="preserve">Revisor / validador operativo</w:t>
+      </w:r>
+    </w:p>
+    <w:p>
+      <w:pPr>
+        <w:pStyle w:val="Listaconvietas"/>
+      </w:pPr>
+      <w:r>
+        <w:rPr>
+          <w:b/>
+        </w:rPr>
+        <w:t xml:space="preserve">Para qué sirve: </w:t>
+      </w:r>
+      <w:r>
+        <w:t xml:space="preserve">Revisar el estado operativo y el historial visible de cada certificado.</w:t>
+      </w:r>
+    </w:p>
+    <w:p>
+      <w:pPr>
+        <w:pStyle w:val="Listaconvietas"/>
+      </w:pPr>
+      <w:r>
+        <w:rPr>
+          <w:b/>
+        </w:rPr>
+        <w:t xml:space="preserve">Cuándo la usa: </w:t>
+      </w:r>
+      <w:r>
+        <w:t xml:space="preserve">Antes de generar, cifrar o validar una operación con certificado.</w:t>
+      </w:r>
+    </w:p>
+    <w:p>
+      <w:pPr>
+        <w:pStyle w:val="Listaconvietas"/>
+      </w:pPr>
+      <w:r>
+        <w:rPr>
+          <w:b/>
+        </w:rPr>
+        <w:t xml:space="preserve">Pasos funcionales: </w:t>
+      </w:r>
+      <w:r>
+        <w:t xml:space="preserve">Abrir certificados, revisar estado y vigencia, y entrar al historial si aplica.</w:t>
+      </w:r>
+    </w:p>
+    <w:p>
+      <w:pPr>
+        <w:pStyle w:val="Listaconvietas"/>
+      </w:pPr>
+      <w:r>
+        <w:rPr>
+          <w:b/>
+        </w:rPr>
+        <w:t xml:space="preserve">Qué debe validar: </w:t>
+      </w:r>
+      <w:r>
+        <w:t xml:space="preserve">Que el certificado mostrado esté vigente o tenga el estado visible esperado.</w:t>
+      </w:r>
+    </w:p>
+    <w:p>
+      <w:pPr>
+        <w:pStyle w:val="Listaconvietas"/>
+      </w:pPr>
+      <w:r>
+        <w:rPr>
+          <w:b/>
+        </w:rPr>
+        <w:t xml:space="preserve">Qué errores debe reportar: </w:t>
+      </w:r>
+      <w:r>
+        <w:t xml:space="preserve">Reportar certificados vencidos, estados no previstos o historial inaccesible.</w:t>
+      </w:r>
+    </w:p>
+    <w:p>
+      <w:pPr>
+        <w:pStyle w:val="Listaconvietas"/>
+      </w:pPr>
+      <w:r>
+        <w:rPr>
+          <w:b/>
+        </w:rPr>
+        <w:t xml:space="preserve">Captura asociada: </w:t>
+      </w:r>
+      <w:r>
+        <w:t xml:space="preserve">52_nacha_security_certificates_gobierno.png; 53_nacha_security_certificate_versions_historial.png; 54_nacha_security_certificates_estados_vigencia_si_visible.png; 55_nacha_security_certificates_rotacion_reemplazo_si_existe.png</w:t>
+      </w:r>
+    </w:p>
+    <w:p>
+      <w:pPr>
+        <w:pStyle w:val="Ttulo2"/>
+      </w:pPr>
+      <w:r>
+        <w:t xml:space="preserve">35.20 Naming reglamentario y archivo final por cámara</w:t>
+      </w:r>
+    </w:p>
+    <w:p>
+      <w:pPr>
+        <w:pStyle w:val="Normal"/>
+      </w:pPr>
+      <w:r>
+        <w:t xml:space="preserve">Resume la salida visible del archivo base, su variante cifrada y la exportación final.</w:t>
+      </w:r>
+    </w:p>
+    <w:p>
+      <w:pPr>
+        <w:pStyle w:val="Listaconvietas"/>
+      </w:pPr>
+      <w:r>
+        <w:rPr>
+          <w:b/>
+        </w:rPr>
+        <w:t xml:space="preserve">Actor principal: </w:t>
+      </w:r>
+      <w:r>
+        <w:t xml:space="preserve">Administrador de certificados digitales</w:t>
+      </w:r>
+    </w:p>
+    <w:p>
+      <w:pPr>
+        <w:pStyle w:val="Listaconvietas"/>
+      </w:pPr>
+      <w:r>
+        <w:rPr>
+          <w:b/>
+        </w:rPr>
+        <w:t xml:space="preserve">Actores secundarios: </w:t>
+      </w:r>
+      <w:r>
+        <w:t xml:space="preserve">Operador ACH</w:t>
+      </w:r>
+    </w:p>
+    <w:p>
+      <w:pPr>
+        <w:pStyle w:val="Listaconvietas"/>
+      </w:pPr>
+      <w:r>
+        <w:rPr>
+          <w:b/>
+        </w:rPr>
+        <w:t xml:space="preserve">Para qué sirve: </w:t>
+      </w:r>
+      <w:r>
+        <w:t xml:space="preserve">Confirmar el nombre visible del archivo y su relación con la cámara.</w:t>
+      </w:r>
+    </w:p>
+    <w:p>
+      <w:pPr>
+        <w:pStyle w:val="Listaconvietas"/>
+      </w:pPr>
+      <w:r>
+        <w:rPr>
+          <w:b/>
+        </w:rPr>
+        <w:t xml:space="preserve">Cuándo la usa: </w:t>
+      </w:r>
+      <w:r>
+        <w:t xml:space="preserve">Durante la generación base, el cifrado o la exportación desde ciclo.</w:t>
+      </w:r>
+    </w:p>
+    <w:p>
+      <w:pPr>
+        <w:pStyle w:val="Listaconvietas"/>
+      </w:pPr>
+      <w:r>
+        <w:rPr>
+          <w:b/>
+        </w:rPr>
+        <w:t xml:space="preserve">Pasos funcionales: </w:t>
+      </w:r>
+      <w:r>
+        <w:t xml:space="preserve">Generar el archivo, revisar el nombre visible y contrastarlo con la cámara usada.</w:t>
+      </w:r>
+    </w:p>
+    <w:p>
+      <w:pPr>
+        <w:pStyle w:val="Listaconvietas"/>
+      </w:pPr>
+      <w:r>
+        <w:rPr>
+          <w:b/>
+        </w:rPr>
+        <w:t xml:space="preserve">Qué debe validar: </w:t>
+      </w:r>
+      <w:r>
+        <w:t xml:space="preserve">Que el nombre base, el cifrado o el final se muestren solo si la pantalla lo expone.</w:t>
+      </w:r>
+    </w:p>
+    <w:p>
+      <w:pPr>
+        <w:pStyle w:val="Listaconvietas"/>
+      </w:pPr>
+      <w:r>
+        <w:rPr>
+          <w:b/>
+        </w:rPr>
+        <w:t xml:space="preserve">Qué errores debe reportar: </w:t>
+      </w:r>
+      <w:r>
+        <w:t xml:space="preserve">Reportar nombre ausente, extensión no visible o naming no coincidente con la cámara.</w:t>
+      </w:r>
+    </w:p>
+    <w:p>
+      <w:pPr>
+        <w:pStyle w:val="Listaconvietas"/>
+      </w:pPr>
+      <w:r>
+        <w:rPr>
+          <w:b/>
+        </w:rPr>
+        <w:t xml:space="preserve">Captura asociada: </w:t>
+      </w:r>
+      <w:r>
+        <w:t xml:space="preserve">57_nacha_generate_base.png; 58_nacha_generate_encrypted.png; 63_ach_cycles_nacha_export.png; 64_naming_archivo_base_por_camara_si_visible.png; 65_naming_archivo_final_env_si_visible.png</w:t>
+      </w:r>
+    </w:p>
+    <w:p>
+      <w:pPr>
+        <w:pStyle w:val="Ttulo1"/>
+      </w:pPr>
+      <w:r>
         <w:rPr>
           <w:rFonts w:ascii="Arial" w:hAnsi="Arial"/>
         </w:rPr>
-        <w:t>35. Cierre</w:t>
+        <w:t>36. Cierre</w:t>
       </w:r>
     </w:p>
     <w:p>

</xml_diff>

<commit_message>
ajuste guia funcional se recupera documento
</commit_message>
<xml_diff>
--- a/entrega_pruebas_funcionales_usuarios/paquete_final/Guia_funcional_pruebas_locales_ACH_Interbank_ACH_COLOMBIA_CENIT_MANUAL_OPERATIVO_COMPLETO_FLUJOS_SUBPANTALLAS.docx
+++ b/entrega_pruebas_funcionales_usuarios/paquete_final/Guia_funcional_pruebas_locales_ACH_Interbank_ACH_COLOMBIA_CENIT_MANUAL_OPERATIVO_COMPLETO_FLUJOS_SUBPANTALLAS.docx
@@ -21508,2595 +21508,14 @@
       </w:r>
     </w:p>
     <w:p>
-      <w:r>
-        <w:br w:type="page"/>
-      </w:r>
-    </w:p>
-    <w:p>
       <w:pPr>
         <w:pStyle w:val="Ttulo1"/>
       </w:pPr>
       <w:r>
-        <w:t xml:space="preserve">35. Ampliación funcional V3</w:t>
-      </w:r>
-    </w:p>
-    <w:p>
-      <w:pPr>
-        <w:pStyle w:val="Normal"/>
-      </w:pPr>
-      <w:r>
-        <w:t xml:space="preserve">Esta ampliación incorpora las pantallas funcionales aprobadas en el barrido dirigido y deja asociada la evidencia textual correspondiente.</w:t>
-      </w:r>
-    </w:p>
-    <w:p>
-      <w:pPr>
-        <w:pStyle w:val="Ttulo2"/>
-      </w:pPr>
-      <w:r>
-        <w:t xml:space="preserve">35.1 Actores funcionales del manual</w:t>
-      </w:r>
-    </w:p>
-    <w:p>
-      <w:pPr>
-        <w:pStyle w:val="Normal"/>
-      </w:pPr>
-      <w:r>
-        <w:t xml:space="preserve">Ordena los perfiles que participan en la ampliación del manual y evita cruces de responsabilidad.</w:t>
-      </w:r>
-    </w:p>
-    <w:p>
-      <w:pPr>
-        <w:pStyle w:val="Listaconvietas"/>
-      </w:pPr>
-      <w:r>
-        <w:rPr>
-          <w:b/>
-        </w:rPr>
-        <w:t xml:space="preserve">Actor principal: </w:t>
-      </w:r>
-      <w:r>
-        <w:t xml:space="preserve">Usuario funcional de pruebas</w:t>
-      </w:r>
-    </w:p>
-    <w:p>
-      <w:pPr>
-        <w:pStyle w:val="Listaconvietas"/>
-      </w:pPr>
-      <w:r>
-        <w:rPr>
-          <w:b/>
-        </w:rPr>
-        <w:t xml:space="preserve">Actores secundarios: </w:t>
-      </w:r>
-      <w:r>
-        <w:t xml:space="preserve">Operador ACH; Revisor / validador operativo; Soporte técnico funcional</w:t>
-      </w:r>
-    </w:p>
-    <w:p>
-      <w:pPr>
-        <w:pStyle w:val="Listaconvietas"/>
-      </w:pPr>
-      <w:r>
-        <w:rPr>
-          <w:b/>
-        </w:rPr>
-        <w:t xml:space="preserve">Para qué sirve: </w:t>
-      </w:r>
-      <w:r>
-        <w:t xml:space="preserve">Definir quién ejecuta, quién valida y quién reporta cada escenario.</w:t>
-      </w:r>
-    </w:p>
-    <w:p>
-      <w:pPr>
-        <w:pStyle w:val="Listaconvietas"/>
-      </w:pPr>
-      <w:r>
-        <w:rPr>
-          <w:b/>
-        </w:rPr>
-        <w:t xml:space="preserve">Cuándo la usa: </w:t>
-      </w:r>
-      <w:r>
-        <w:t xml:space="preserve">Se usa al inicio de la jornada y antes de clasificar incidencias.</w:t>
-      </w:r>
-    </w:p>
-    <w:p>
-      <w:pPr>
-        <w:pStyle w:val="Listaconvietas"/>
-      </w:pPr>
-      <w:r>
-        <w:rPr>
-          <w:b/>
-        </w:rPr>
-        <w:t xml:space="preserve">Pasos funcionales: </w:t>
-      </w:r>
-      <w:r>
-        <w:t xml:space="preserve">Confirmar el rol, abrir la pantalla correspondiente y registrar la evidencia de forma ordenada.</w:t>
-      </w:r>
-    </w:p>
-    <w:p>
-      <w:pPr>
-        <w:pStyle w:val="Listaconvietas"/>
-      </w:pPr>
-      <w:r>
-        <w:rPr>
-          <w:b/>
-        </w:rPr>
-        <w:t xml:space="preserve">Qué debe validar: </w:t>
-      </w:r>
-      <w:r>
-        <w:t xml:space="preserve">Que cada escenario tenga un actor principal y un responsable de seguimiento.</w:t>
-      </w:r>
-    </w:p>
-    <w:p>
-      <w:pPr>
-        <w:pStyle w:val="Listaconvietas"/>
-      </w:pPr>
-      <w:r>
-        <w:rPr>
-          <w:b/>
-        </w:rPr>
-        <w:t xml:space="preserve">Qué errores debe reportar: </w:t>
-      </w:r>
-      <w:r>
-        <w:t xml:space="preserve">Reportar confusión de roles, escenarios sin dueño o validaciones mezcladas.</w:t>
-      </w:r>
-    </w:p>
-    <w:p>
-      <w:pPr>
-        <w:pStyle w:val="Listaconvietas"/>
-      </w:pPr>
-      <w:r>
-        <w:rPr>
-          <w:b/>
-        </w:rPr>
-        <w:t xml:space="preserve">Captura asociada: </w:t>
-      </w:r>
-      <w:r>
-        <w:t xml:space="preserve">No aplica</w:t>
-      </w:r>
-    </w:p>
-    <w:p>
-      <w:pPr>
-        <w:pStyle w:val="Ttulo2"/>
-      </w:pPr>
-      <w:r>
-        <w:t xml:space="preserve">35.2 Preparación funcional de datos maestros</w:t>
-      </w:r>
-    </w:p>
-    <w:p>
-      <w:pPr>
-        <w:pStyle w:val="Normal"/>
-      </w:pPr>
-      <w:r>
-        <w:t xml:space="preserve">Consolida la información base que debe existir antes de ejecutar altas, reglas o ciclos.</w:t>
-      </w:r>
-    </w:p>
-    <w:p>
-      <w:pPr>
-        <w:pStyle w:val="Listaconvietas"/>
-      </w:pPr>
-      <w:r>
-        <w:rPr>
-          <w:b/>
-        </w:rPr>
-        <w:t xml:space="preserve">Actor principal: </w:t>
-      </w:r>
-      <w:r>
-        <w:t xml:space="preserve">Administrador de catálogos / parametrización</w:t>
-      </w:r>
-    </w:p>
-    <w:p>
-      <w:pPr>
-        <w:pStyle w:val="Listaconvietas"/>
-      </w:pPr>
-      <w:r>
-        <w:rPr>
-          <w:b/>
-        </w:rPr>
-        <w:t xml:space="preserve">Actores secundarios: </w:t>
-      </w:r>
-      <w:r>
-        <w:t xml:space="preserve">Administrador funcional ACH; Operador ACH</w:t>
-      </w:r>
-    </w:p>
-    <w:p>
-      <w:pPr>
-        <w:pStyle w:val="Listaconvietas"/>
-      </w:pPr>
-      <w:r>
-        <w:rPr>
-          <w:b/>
-        </w:rPr>
-        <w:t xml:space="preserve">Para qué sirve: </w:t>
-      </w:r>
-      <w:r>
-        <w:t xml:space="preserve">Dejar listos los catálogos y prioridades que consumen las demás pantallas.</w:t>
-      </w:r>
-    </w:p>
-    <w:p>
-      <w:pPr>
-        <w:pStyle w:val="Listaconvietas"/>
-      </w:pPr>
-      <w:r>
-        <w:rPr>
-          <w:b/>
-        </w:rPr>
-        <w:t xml:space="preserve">Cuándo la usa: </w:t>
-      </w:r>
-      <w:r>
-        <w:t xml:space="preserve">Antes de crear clientes, terceros, entidades financieras o reglas por cámara.</w:t>
-      </w:r>
-    </w:p>
-    <w:p>
-      <w:pPr>
-        <w:pStyle w:val="Listaconvietas"/>
-      </w:pPr>
-      <w:r>
-        <w:rPr>
-          <w:b/>
-        </w:rPr>
-        <w:t xml:space="preserve">Pasos funcionales: </w:t>
-      </w:r>
-      <w:r>
-        <w:t xml:space="preserve">Revisar catálogos, confirmar vigencias visibles y validar que no falten registros básicos.</w:t>
-      </w:r>
-    </w:p>
-    <w:p>
-      <w:pPr>
-        <w:pStyle w:val="Listaconvietas"/>
-      </w:pPr>
-      <w:r>
-        <w:rPr>
-          <w:b/>
-        </w:rPr>
-        <w:t xml:space="preserve">Qué debe validar: </w:t>
-      </w:r>
-      <w:r>
-        <w:t xml:space="preserve">Que la información maestra sea consistente con la cámara y el escenario de prueba.</w:t>
-      </w:r>
-    </w:p>
-    <w:p>
-      <w:pPr>
-        <w:pStyle w:val="Listaconvietas"/>
-      </w:pPr>
-      <w:r>
-        <w:rPr>
-          <w:b/>
-        </w:rPr>
-        <w:t xml:space="preserve">Qué errores debe reportar: </w:t>
-      </w:r>
-      <w:r>
-        <w:t xml:space="preserve">Reportar registros duplicados, catálogos incompletos o datos inactivos inesperados.</w:t>
-      </w:r>
-    </w:p>
-    <w:p>
-      <w:pPr>
-        <w:pStyle w:val="Listaconvietas"/>
-      </w:pPr>
-      <w:r>
-        <w:rPr>
-          <w:b/>
-        </w:rPr>
-        <w:t xml:space="preserve">Captura asociada: </w:t>
-      </w:r>
-      <w:r>
-        <w:t xml:space="preserve">32_financial_institutions_mantenimiento_digito_verificacion.png; 34_catalog_document_types.png; 35_catalog_gender_types.png; 36_catalog_person_types.png; 37_catalog_transaction_codes.png; 38_catalog_company_entry_descriptions.png</w:t>
-      </w:r>
-    </w:p>
-    <w:p>
-      <w:pPr>
-        <w:pStyle w:val="Ttulo2"/>
-      </w:pPr>
-      <w:r>
-        <w:t xml:space="preserve">35.3 Onboarding silencioso, si existe</w:t>
-      </w:r>
-    </w:p>
-    <w:p>
-      <w:pPr>
-        <w:pStyle w:val="Normal"/>
-      </w:pPr>
-      <w:r>
-        <w:t xml:space="preserve">Permite detectar si la aplicación ofrece ayuda automática, prellenado o pasos invisibles durante las altas.</w:t>
-      </w:r>
-    </w:p>
-    <w:p>
-      <w:pPr>
-        <w:pStyle w:val="Listaconvietas"/>
-      </w:pPr>
-      <w:r>
-        <w:rPr>
-          <w:b/>
-        </w:rPr>
-        <w:t xml:space="preserve">Actor principal: </w:t>
-      </w:r>
-      <w:r>
-        <w:t xml:space="preserve">Usuario funcional de pruebas</w:t>
-      </w:r>
-    </w:p>
-    <w:p>
-      <w:pPr>
-        <w:pStyle w:val="Listaconvietas"/>
-      </w:pPr>
-      <w:r>
-        <w:rPr>
-          <w:b/>
-        </w:rPr>
-        <w:t xml:space="preserve">Actores secundarios: </w:t>
-      </w:r>
-      <w:r>
-        <w:t xml:space="preserve">Soporte técnico funcional</w:t>
-      </w:r>
-    </w:p>
-    <w:p>
-      <w:pPr>
-        <w:pStyle w:val="Listaconvietas"/>
-      </w:pPr>
-      <w:r>
-        <w:rPr>
-          <w:b/>
-        </w:rPr>
-        <w:t xml:space="preserve">Para qué sirve: </w:t>
-      </w:r>
-      <w:r>
-        <w:t xml:space="preserve">Verificar si el flujo guía al usuario sin mostrar una pantalla dedicada.</w:t>
-      </w:r>
-    </w:p>
-    <w:p>
-      <w:pPr>
-        <w:pStyle w:val="Listaconvietas"/>
-      </w:pPr>
-      <w:r>
-        <w:rPr>
-          <w:b/>
-        </w:rPr>
-        <w:t xml:space="preserve">Cuándo la usa: </w:t>
-      </w:r>
-      <w:r>
-        <w:t xml:space="preserve">Durante la creación de clientes o de datos maestros, si la interfaz muestra ayuda automática.</w:t>
-      </w:r>
-    </w:p>
-    <w:p>
-      <w:pPr>
-        <w:pStyle w:val="Listaconvietas"/>
-      </w:pPr>
-      <w:r>
-        <w:rPr>
-          <w:b/>
-        </w:rPr>
-        <w:t xml:space="preserve">Pasos funcionales: </w:t>
-      </w:r>
-      <w:r>
-        <w:t xml:space="preserve">Abrir una alta, observar si aparecen ayudas o valores precargados y registrar lo visible.</w:t>
-      </w:r>
-    </w:p>
-    <w:p>
-      <w:pPr>
-        <w:pStyle w:val="Listaconvietas"/>
-      </w:pPr>
-      <w:r>
-        <w:rPr>
-          <w:b/>
-        </w:rPr>
-        <w:t xml:space="preserve">Qué debe validar: </w:t>
-      </w:r>
-      <w:r>
-        <w:t xml:space="preserve">Que cualquier ayuda automática sea clara y no cambie datos sin aviso.</w:t>
-      </w:r>
-    </w:p>
-    <w:p>
-      <w:pPr>
-        <w:pStyle w:val="Listaconvietas"/>
-      </w:pPr>
-      <w:r>
-        <w:rPr>
-          <w:b/>
-        </w:rPr>
-        <w:t xml:space="preserve">Qué errores debe reportar: </w:t>
-      </w:r>
-      <w:r>
-        <w:t xml:space="preserve">Reportar si aparece un flujo automático confuso o si no se puede continuar.</w:t>
-      </w:r>
-    </w:p>
-    <w:p>
-      <w:pPr>
-        <w:pStyle w:val="Listaconvietas"/>
-      </w:pPr>
-      <w:r>
-        <w:rPr>
-          <w:b/>
-        </w:rPr>
-        <w:t xml:space="preserve">Captura asociada: </w:t>
-      </w:r>
-      <w:r>
-        <w:t xml:space="preserve">50_onboarding_silencioso_si_aparece.png</w:t>
-      </w:r>
-    </w:p>
-    <w:p>
-      <w:pPr>
-        <w:pStyle w:val="Ttulo2"/>
-      </w:pPr>
-      <w:r>
-        <w:t xml:space="preserve">35.4 Administración de terceros de prenotificación</w:t>
-      </w:r>
-    </w:p>
-    <w:p>
-      <w:pPr>
-        <w:pStyle w:val="Normal"/>
-      </w:pPr>
-      <w:r>
-        <w:t xml:space="preserve">Cubre la consulta y revisión de terceros usados en prenotificación.</w:t>
-      </w:r>
-    </w:p>
-    <w:p>
-      <w:pPr>
-        <w:pStyle w:val="Listaconvietas"/>
-      </w:pPr>
-      <w:r>
-        <w:rPr>
-          <w:b/>
-        </w:rPr>
-        <w:t xml:space="preserve">Actor principal: </w:t>
-      </w:r>
-      <w:r>
-        <w:t xml:space="preserve">Operador ACH</w:t>
-      </w:r>
-    </w:p>
-    <w:p>
-      <w:pPr>
-        <w:pStyle w:val="Listaconvietas"/>
-      </w:pPr>
-      <w:r>
-        <w:rPr>
-          <w:b/>
-        </w:rPr>
-        <w:t xml:space="preserve">Actores secundarios: </w:t>
-      </w:r>
-      <w:r>
-        <w:t xml:space="preserve">Revisor / validador operativo</w:t>
-      </w:r>
-    </w:p>
-    <w:p>
-      <w:pPr>
-        <w:pStyle w:val="Listaconvietas"/>
-      </w:pPr>
-      <w:r>
-        <w:rPr>
-          <w:b/>
-        </w:rPr>
-        <w:t xml:space="preserve">Para qué sirve: </w:t>
-      </w:r>
-      <w:r>
-        <w:t xml:space="preserve">Consultar terceros y validar su estado operativo antes de una prenotificación.</w:t>
-      </w:r>
-    </w:p>
-    <w:p>
-      <w:pPr>
-        <w:pStyle w:val="Listaconvietas"/>
-      </w:pPr>
-      <w:r>
-        <w:rPr>
-          <w:b/>
-        </w:rPr>
-        <w:t xml:space="preserve">Cuándo la usa: </w:t>
-      </w:r>
-      <w:r>
-        <w:t xml:space="preserve">Antes de aprobar, revisar o rechazar un tercero relacionado con prenotificación.</w:t>
-      </w:r>
-    </w:p>
-    <w:p>
-      <w:pPr>
-        <w:pStyle w:val="Listaconvietas"/>
-      </w:pPr>
-      <w:r>
-        <w:rPr>
-          <w:b/>
-        </w:rPr>
-        <w:t xml:space="preserve">Pasos funcionales: </w:t>
-      </w:r>
-      <w:r>
-        <w:t xml:space="preserve">Buscar el tercero, revisar sus datos y confirmar si el estado permite continuar.</w:t>
-      </w:r>
-    </w:p>
-    <w:p>
-      <w:pPr>
-        <w:pStyle w:val="Listaconvietas"/>
-      </w:pPr>
-      <w:r>
-        <w:rPr>
-          <w:b/>
-        </w:rPr>
-        <w:t xml:space="preserve">Qué debe validar: </w:t>
-      </w:r>
-      <w:r>
-        <w:t xml:space="preserve">Que el tercero, la cuenta y el estado coincidan con el caso de prueba.</w:t>
-      </w:r>
-    </w:p>
-    <w:p>
-      <w:pPr>
-        <w:pStyle w:val="Listaconvietas"/>
-      </w:pPr>
-      <w:r>
-        <w:rPr>
-          <w:b/>
-        </w:rPr>
-        <w:t xml:space="preserve">Qué errores debe reportar: </w:t>
-      </w:r>
-      <w:r>
-        <w:t xml:space="preserve">Reportar estados inesperados, datos incompletos o inconsistencias de receptor.</w:t>
-      </w:r>
-    </w:p>
-    <w:p>
-      <w:pPr>
-        <w:pStyle w:val="Listaconvietas"/>
-      </w:pPr>
-      <w:r>
-        <w:rPr>
-          <w:b/>
-        </w:rPr>
-        <w:t xml:space="preserve">Captura asociada: </w:t>
-      </w:r>
-      <w:r>
-        <w:t xml:space="preserve">28_customer_third_parties_listado_busqueda.png; 29_customer_third_parties_creacion_si_existe.png</w:t>
-      </w:r>
-    </w:p>
-    <w:p>
-      <w:pPr>
-        <w:pStyle w:val="Ttulo2"/>
-      </w:pPr>
-      <w:r>
-        <w:t xml:space="preserve">35.5 Administración de clientes</w:t>
-      </w:r>
-    </w:p>
-    <w:p>
-      <w:pPr>
-        <w:pStyle w:val="Normal"/>
-      </w:pPr>
-      <w:r>
-        <w:t xml:space="preserve">Agrupa la consulta y el alta de clientes que alimentan la operación ACH.</w:t>
-      </w:r>
-    </w:p>
-    <w:p>
-      <w:pPr>
-        <w:pStyle w:val="Listaconvietas"/>
-      </w:pPr>
-      <w:r>
-        <w:rPr>
-          <w:b/>
-        </w:rPr>
-        <w:t xml:space="preserve">Actor principal: </w:t>
-      </w:r>
-      <w:r>
-        <w:t xml:space="preserve">Operador ACH</w:t>
-      </w:r>
-    </w:p>
-    <w:p>
-      <w:pPr>
-        <w:pStyle w:val="Listaconvietas"/>
-      </w:pPr>
-      <w:r>
-        <w:rPr>
-          <w:b/>
-        </w:rPr>
-        <w:t xml:space="preserve">Actores secundarios: </w:t>
-      </w:r>
-      <w:r>
-        <w:t xml:space="preserve">Usuario funcional de pruebas</w:t>
-      </w:r>
-    </w:p>
-    <w:p>
-      <w:pPr>
-        <w:pStyle w:val="Listaconvietas"/>
-      </w:pPr>
-      <w:r>
-        <w:rPr>
-          <w:b/>
-        </w:rPr>
-        <w:t xml:space="preserve">Para qué sirve: </w:t>
-      </w:r>
-      <w:r>
-        <w:t xml:space="preserve">Registrar o consultar clientes asociados a escenarios funcionales.</w:t>
-      </w:r>
-    </w:p>
-    <w:p>
-      <w:pPr>
-        <w:pStyle w:val="Listaconvietas"/>
-      </w:pPr>
-      <w:r>
-        <w:rPr>
-          <w:b/>
-        </w:rPr>
-        <w:t xml:space="preserve">Cuándo la usa: </w:t>
-      </w:r>
-      <w:r>
-        <w:t xml:space="preserve">Cuando el caso requiere crear o revisar un cliente de prueba.</w:t>
-      </w:r>
-    </w:p>
-    <w:p>
-      <w:pPr>
-        <w:pStyle w:val="Listaconvietas"/>
-      </w:pPr>
-      <w:r>
-        <w:rPr>
-          <w:b/>
-        </w:rPr>
-        <w:t xml:space="preserve">Pasos funcionales: </w:t>
-      </w:r>
-      <w:r>
-        <w:t xml:space="preserve">Abrir la lista, entrar al alta o edición y guardar solo si la información es válida.</w:t>
-      </w:r>
-    </w:p>
-    <w:p>
-      <w:pPr>
-        <w:pStyle w:val="Listaconvietas"/>
-      </w:pPr>
-      <w:r>
-        <w:rPr>
-          <w:b/>
-        </w:rPr>
-        <w:t xml:space="preserve">Qué debe validar: </w:t>
-      </w:r>
-      <w:r>
-        <w:t xml:space="preserve">Que el cliente quede visible y con los datos esperados en pantalla.</w:t>
-      </w:r>
-    </w:p>
-    <w:p>
-      <w:pPr>
-        <w:pStyle w:val="Listaconvietas"/>
-      </w:pPr>
-      <w:r>
-        <w:rPr>
-          <w:b/>
-        </w:rPr>
-        <w:t xml:space="preserve">Qué errores debe reportar: </w:t>
-      </w:r>
-      <w:r>
-        <w:t xml:space="preserve">Reportar validaciones fallidas, campos obligatorios vacíos o navegación incorrecta.</w:t>
-      </w:r>
-    </w:p>
-    <w:p>
-      <w:pPr>
-        <w:pStyle w:val="Listaconvietas"/>
-      </w:pPr>
-      <w:r>
-        <w:rPr>
-          <w:b/>
-        </w:rPr>
-        <w:t xml:space="preserve">Captura asociada: </w:t>
-      </w:r>
-      <w:r>
-        <w:t xml:space="preserve">30_customers_listado.png; 31_customers_nuevo.png</w:t>
-      </w:r>
-    </w:p>
-    <w:p>
-      <w:pPr>
-        <w:pStyle w:val="Ttulo2"/>
-      </w:pPr>
-      <w:r>
-        <w:t xml:space="preserve">35.6 Administración de entidades financieras</w:t>
-      </w:r>
-    </w:p>
-    <w:p>
-      <w:pPr>
-        <w:pStyle w:val="Normal"/>
-      </w:pPr>
-      <w:r>
-        <w:t xml:space="preserve">Reúne la consulta y mantenimiento de entidades financieras usadas por la operación.</w:t>
-      </w:r>
-    </w:p>
-    <w:p>
-      <w:pPr>
-        <w:pStyle w:val="Listaconvietas"/>
-      </w:pPr>
-      <w:r>
-        <w:rPr>
-          <w:b/>
-        </w:rPr>
-        <w:t xml:space="preserve">Actor principal: </w:t>
-      </w:r>
-      <w:r>
-        <w:t xml:space="preserve">Administrador de catálogos / parametrización</w:t>
-      </w:r>
-    </w:p>
-    <w:p>
-      <w:pPr>
-        <w:pStyle w:val="Listaconvietas"/>
-      </w:pPr>
-      <w:r>
-        <w:rPr>
-          <w:b/>
-        </w:rPr>
-        <w:t xml:space="preserve">Actores secundarios: </w:t>
-      </w:r>
-      <w:r>
-        <w:t xml:space="preserve">Administrador funcional ACH</w:t>
-      </w:r>
-    </w:p>
-    <w:p>
-      <w:pPr>
-        <w:pStyle w:val="Listaconvietas"/>
-      </w:pPr>
-      <w:r>
-        <w:rPr>
-          <w:b/>
-        </w:rPr>
-        <w:t xml:space="preserve">Para qué sirve: </w:t>
-      </w:r>
-      <w:r>
-        <w:t xml:space="preserve">Mantener routing, tránsito, estado y dígito visible cuando aplique.</w:t>
-      </w:r>
-    </w:p>
-    <w:p>
-      <w:pPr>
-        <w:pStyle w:val="Listaconvietas"/>
-      </w:pPr>
-      <w:r>
-        <w:rPr>
-          <w:b/>
-        </w:rPr>
-        <w:t xml:space="preserve">Cuándo la usa: </w:t>
-      </w:r>
-      <w:r>
-        <w:t xml:space="preserve">Antes de ejecutar pruebas que dependan de la entidad destino u origen.</w:t>
-      </w:r>
-    </w:p>
-    <w:p>
-      <w:pPr>
-        <w:pStyle w:val="Listaconvietas"/>
-      </w:pPr>
-      <w:r>
-        <w:rPr>
-          <w:b/>
-        </w:rPr>
-        <w:t xml:space="preserve">Pasos funcionales: </w:t>
-      </w:r>
-      <w:r>
-        <w:t xml:space="preserve">Abrir el catálogo, revisar el registro y confirmar los datos visibles del mantenimiento.</w:t>
-      </w:r>
-    </w:p>
-    <w:p>
-      <w:pPr>
-        <w:pStyle w:val="Listaconvietas"/>
-      </w:pPr>
-      <w:r>
-        <w:rPr>
-          <w:b/>
-        </w:rPr>
-        <w:t xml:space="preserve">Qué debe validar: </w:t>
-      </w:r>
-      <w:r>
-        <w:t xml:space="preserve">Que la entidad tenga estado, códigos y dígito coherentes con la pantalla.</w:t>
-      </w:r>
-    </w:p>
-    <w:p>
-      <w:pPr>
-        <w:pStyle w:val="Listaconvietas"/>
-      </w:pPr>
-      <w:r>
-        <w:rPr>
-          <w:b/>
-        </w:rPr>
-        <w:t xml:space="preserve">Qué errores debe reportar: </w:t>
-      </w:r>
-      <w:r>
-        <w:t xml:space="preserve">Reportar dígito ausente, estados inactivos inesperados o inconsistencias de edición.</w:t>
-      </w:r>
-    </w:p>
-    <w:p>
-      <w:pPr>
-        <w:pStyle w:val="Listaconvietas"/>
-      </w:pPr>
-      <w:r>
-        <w:rPr>
-          <w:b/>
-        </w:rPr>
-        <w:t xml:space="preserve">Captura asociada: </w:t>
-      </w:r>
-      <w:r>
-        <w:t xml:space="preserve">32_financial_institutions_mantenimiento_digito_verificacion.png</w:t>
-      </w:r>
-    </w:p>
-    <w:p>
-      <w:pPr>
-        <w:pStyle w:val="Ttulo2"/>
-      </w:pPr>
-      <w:r>
-        <w:t xml:space="preserve">35.7 Priorización por cámara ACH Colombia / CENIT</w:t>
-      </w:r>
-    </w:p>
-    <w:p>
-      <w:pPr>
-        <w:pStyle w:val="Normal"/>
-      </w:pPr>
-      <w:r>
-        <w:t xml:space="preserve">Muestra cómo se ordenan las preferencias funcionales por cámara.</w:t>
-      </w:r>
-    </w:p>
-    <w:p>
-      <w:pPr>
-        <w:pStyle w:val="Listaconvietas"/>
-      </w:pPr>
-      <w:r>
-        <w:rPr>
-          <w:b/>
-        </w:rPr>
-        <w:t xml:space="preserve">Actor principal: </w:t>
-      </w:r>
-      <w:r>
-        <w:t xml:space="preserve">Administrador funcional ACH</w:t>
-      </w:r>
-    </w:p>
-    <w:p>
-      <w:pPr>
-        <w:pStyle w:val="Listaconvietas"/>
-      </w:pPr>
-      <w:r>
-        <w:rPr>
-          <w:b/>
-        </w:rPr>
-        <w:t xml:space="preserve">Actores secundarios: </w:t>
-      </w:r>
-      <w:r>
-        <w:t xml:space="preserve">Operador ACH</w:t>
-      </w:r>
-    </w:p>
-    <w:p>
-      <w:pPr>
-        <w:pStyle w:val="Listaconvietas"/>
-      </w:pPr>
-      <w:r>
-        <w:rPr>
-          <w:b/>
-        </w:rPr>
-        <w:t xml:space="preserve">Para qué sirve: </w:t>
-      </w:r>
-      <w:r>
-        <w:t xml:space="preserve">Confirmar qué cámara queda priorizada para la operación visible.</w:t>
-      </w:r>
-    </w:p>
-    <w:p>
-      <w:pPr>
-        <w:pStyle w:val="Listaconvietas"/>
-      </w:pPr>
-      <w:r>
-        <w:rPr>
-          <w:b/>
-        </w:rPr>
-        <w:t xml:space="preserve">Cuándo la usa: </w:t>
-      </w:r>
-      <w:r>
-        <w:t xml:space="preserve">Al ajustar reglas o al revisar la prioridad aplicada a un caso.</w:t>
-      </w:r>
-    </w:p>
-    <w:p>
-      <w:pPr>
-        <w:pStyle w:val="Listaconvietas"/>
-      </w:pPr>
-      <w:r>
-        <w:rPr>
-          <w:b/>
-        </w:rPr>
-        <w:t xml:space="preserve">Pasos funcionales: </w:t>
-      </w:r>
-      <w:r>
-        <w:t xml:space="preserve">Abrir la pantalla, comparar la cámara activa y validar el orden mostrado.</w:t>
-      </w:r>
-    </w:p>
-    <w:p>
-      <w:pPr>
-        <w:pStyle w:val="Listaconvietas"/>
-      </w:pPr>
-      <w:r>
-        <w:rPr>
-          <w:b/>
-        </w:rPr>
-        <w:t xml:space="preserve">Qué debe validar: </w:t>
-      </w:r>
-      <w:r>
-        <w:t xml:space="preserve">Que ACH Colombia y CENIT mantengan la prioridad esperada.</w:t>
-      </w:r>
-    </w:p>
-    <w:p>
-      <w:pPr>
-        <w:pStyle w:val="Listaconvietas"/>
-      </w:pPr>
-      <w:r>
-        <w:rPr>
-          <w:b/>
-        </w:rPr>
-        <w:t xml:space="preserve">Qué errores debe reportar: </w:t>
-      </w:r>
-      <w:r>
-        <w:t xml:space="preserve">Reportar prioridad invertida, falta de cámara o cambios no previstos.</w:t>
-      </w:r>
-    </w:p>
-    <w:p>
-      <w:pPr>
-        <w:pStyle w:val="Listaconvietas"/>
-      </w:pPr>
-      <w:r>
-        <w:rPr>
-          <w:b/>
-        </w:rPr>
-        <w:t xml:space="preserve">Captura asociada: </w:t>
-      </w:r>
-      <w:r>
-        <w:t xml:space="preserve">33_clearing_house_preferences_prioridades_camara.png</w:t>
-      </w:r>
-    </w:p>
-    <w:p>
-      <w:pPr>
-        <w:pStyle w:val="Ttulo2"/>
-      </w:pPr>
-      <w:r>
-        <w:t xml:space="preserve">35.8 Tipos de documento, género y persona</w:t>
-      </w:r>
-    </w:p>
-    <w:p>
-      <w:pPr>
-        <w:pStyle w:val="Normal"/>
-      </w:pPr>
-      <w:r>
-        <w:t xml:space="preserve">Agrupa los catálogos que soportan la clasificación básica de personas y documentos.</w:t>
-      </w:r>
-    </w:p>
-    <w:p>
-      <w:pPr>
-        <w:pStyle w:val="Listaconvietas"/>
-      </w:pPr>
-      <w:r>
-        <w:rPr>
-          <w:b/>
-        </w:rPr>
-        <w:t xml:space="preserve">Actor principal: </w:t>
-      </w:r>
-      <w:r>
-        <w:t xml:space="preserve">Administrador de catálogos / parametrización</w:t>
-      </w:r>
-    </w:p>
-    <w:p>
-      <w:pPr>
-        <w:pStyle w:val="Listaconvietas"/>
-      </w:pPr>
-      <w:r>
-        <w:rPr>
-          <w:b/>
-        </w:rPr>
-        <w:t xml:space="preserve">Actores secundarios: </w:t>
-      </w:r>
-      <w:r>
-        <w:t xml:space="preserve">Operador ACH</w:t>
-      </w:r>
-    </w:p>
-    <w:p>
-      <w:pPr>
-        <w:pStyle w:val="Listaconvietas"/>
-      </w:pPr>
-      <w:r>
-        <w:rPr>
-          <w:b/>
-        </w:rPr>
-        <w:t xml:space="preserve">Para qué sirve: </w:t>
-      </w:r>
-      <w:r>
-        <w:t xml:space="preserve">Mantener catálogos maestros visibles y consistentes para las altas.</w:t>
-      </w:r>
-    </w:p>
-    <w:p>
-      <w:pPr>
-        <w:pStyle w:val="Listaconvietas"/>
-      </w:pPr>
-      <w:r>
-        <w:rPr>
-          <w:b/>
-        </w:rPr>
-        <w:t xml:space="preserve">Cuándo la usa: </w:t>
-      </w:r>
-      <w:r>
-        <w:t xml:space="preserve">Antes de crear o editar clientes y terceros.</w:t>
-      </w:r>
-    </w:p>
-    <w:p>
-      <w:pPr>
-        <w:pStyle w:val="Listaconvietas"/>
-      </w:pPr>
-      <w:r>
-        <w:rPr>
-          <w:b/>
-        </w:rPr>
-        <w:t xml:space="preserve">Pasos funcionales: </w:t>
-      </w:r>
-      <w:r>
-        <w:t xml:space="preserve">Revisar cada catálogo, confirmar que el valor exista y verificar su estado visible.</w:t>
-      </w:r>
-    </w:p>
-    <w:p>
-      <w:pPr>
-        <w:pStyle w:val="Listaconvietas"/>
-      </w:pPr>
-      <w:r>
-        <w:rPr>
-          <w:b/>
-        </w:rPr>
-        <w:t xml:space="preserve">Qué debe validar: </w:t>
-      </w:r>
-      <w:r>
-        <w:t xml:space="preserve">Que los catálogos permitan seleccionar el valor correcto sin ambigüedad.</w:t>
-      </w:r>
-    </w:p>
-    <w:p>
-      <w:pPr>
-        <w:pStyle w:val="Listaconvietas"/>
-      </w:pPr>
-      <w:r>
-        <w:rPr>
-          <w:b/>
-        </w:rPr>
-        <w:t xml:space="preserve">Qué errores debe reportar: </w:t>
-      </w:r>
-      <w:r>
-        <w:t xml:space="preserve">Reportar catálogos vacíos, textos incorrectos o valores que no aparezcan.</w:t>
-      </w:r>
-    </w:p>
-    <w:p>
-      <w:pPr>
-        <w:pStyle w:val="Listaconvietas"/>
-      </w:pPr>
-      <w:r>
-        <w:rPr>
-          <w:b/>
-        </w:rPr>
-        <w:t xml:space="preserve">Captura asociada: </w:t>
-      </w:r>
-      <w:r>
-        <w:t xml:space="preserve">34_catalog_document_types.png; 35_catalog_gender_types.png; 36_catalog_person_types.png</w:t>
-      </w:r>
-    </w:p>
-    <w:p>
-      <w:pPr>
-        <w:pStyle w:val="Ttulo2"/>
-      </w:pPr>
-      <w:r>
-        <w:t xml:space="preserve">35.9 Tipos o códigos de transacción ACH</w:t>
-      </w:r>
-    </w:p>
-    <w:p>
-      <w:pPr>
-        <w:pStyle w:val="Normal"/>
-      </w:pPr>
-      <w:r>
-        <w:t xml:space="preserve">Describe el catálogo que define la clasificación de la transacción ACH.</w:t>
-      </w:r>
-    </w:p>
-    <w:p>
-      <w:pPr>
-        <w:pStyle w:val="Listaconvietas"/>
-      </w:pPr>
-      <w:r>
-        <w:rPr>
-          <w:b/>
-        </w:rPr>
-        <w:t xml:space="preserve">Actor principal: </w:t>
-      </w:r>
-      <w:r>
-        <w:t xml:space="preserve">Administrador de catálogos / parametrización</w:t>
-      </w:r>
-    </w:p>
-    <w:p>
-      <w:pPr>
-        <w:pStyle w:val="Listaconvietas"/>
-      </w:pPr>
-      <w:r>
-        <w:rPr>
-          <w:b/>
-        </w:rPr>
-        <w:t xml:space="preserve">Actores secundarios: </w:t>
-      </w:r>
-      <w:r>
-        <w:t xml:space="preserve">Administrador funcional ACH</w:t>
-      </w:r>
-    </w:p>
-    <w:p>
-      <w:pPr>
-        <w:pStyle w:val="Listaconvietas"/>
-      </w:pPr>
-      <w:r>
-        <w:rPr>
-          <w:b/>
-        </w:rPr>
-        <w:t xml:space="preserve">Para qué sirve: </w:t>
-      </w:r>
-      <w:r>
-        <w:t xml:space="preserve">Asegurar que el código funcional correcto esté disponible en pantalla.</w:t>
-      </w:r>
-    </w:p>
-    <w:p>
-      <w:pPr>
-        <w:pStyle w:val="Listaconvietas"/>
-      </w:pPr>
-      <w:r>
-        <w:rPr>
-          <w:b/>
-        </w:rPr>
-        <w:t xml:space="preserve">Cuándo la usa: </w:t>
-      </w:r>
-      <w:r>
-        <w:t xml:space="preserve">Al preparar reglas, lotes o transacciones para una prueba.</w:t>
-      </w:r>
-    </w:p>
-    <w:p>
-      <w:pPr>
-        <w:pStyle w:val="Listaconvietas"/>
-      </w:pPr>
-      <w:r>
-        <w:rPr>
-          <w:b/>
-        </w:rPr>
-        <w:t xml:space="preserve">Pasos funcionales: </w:t>
-      </w:r>
-      <w:r>
-        <w:t xml:space="preserve">Abrir el catálogo, ubicar el código y revisar su vigencia o estado visible.</w:t>
-      </w:r>
-    </w:p>
-    <w:p>
-      <w:pPr>
-        <w:pStyle w:val="Listaconvietas"/>
-      </w:pPr>
-      <w:r>
-        <w:rPr>
-          <w:b/>
-        </w:rPr>
-        <w:t xml:space="preserve">Qué debe validar: </w:t>
-      </w:r>
-      <w:r>
-        <w:t xml:space="preserve">Que el código corresponda al escenario de prueba y se pueda consultar.</w:t>
-      </w:r>
-    </w:p>
-    <w:p>
-      <w:pPr>
-        <w:pStyle w:val="Listaconvietas"/>
-      </w:pPr>
-      <w:r>
-        <w:rPr>
-          <w:b/>
-        </w:rPr>
-        <w:t xml:space="preserve">Qué errores debe reportar: </w:t>
-      </w:r>
-      <w:r>
-        <w:t xml:space="preserve">Reportar códigos faltantes, descripciones erradas o estados incorrectos.</w:t>
-      </w:r>
-    </w:p>
-    <w:p>
-      <w:pPr>
-        <w:pStyle w:val="Listaconvietas"/>
-      </w:pPr>
-      <w:r>
-        <w:rPr>
-          <w:b/>
-        </w:rPr>
-        <w:t xml:space="preserve">Captura asociada: </w:t>
-      </w:r>
-      <w:r>
-        <w:t xml:space="preserve">37_catalog_transaction_codes.png</w:t>
-      </w:r>
-    </w:p>
-    <w:p>
-      <w:pPr>
-        <w:pStyle w:val="Ttulo2"/>
-      </w:pPr>
-      <w:r>
-        <w:t xml:space="preserve">35.10 Conceptos de lote</w:t>
-      </w:r>
-    </w:p>
-    <w:p>
-      <w:pPr>
-        <w:pStyle w:val="Normal"/>
-      </w:pPr>
-      <w:r>
-        <w:t xml:space="preserve">Permite revisar los conceptos de lote utilizados en la operación.</w:t>
-      </w:r>
-    </w:p>
-    <w:p>
-      <w:pPr>
-        <w:pStyle w:val="Listaconvietas"/>
-      </w:pPr>
-      <w:r>
-        <w:rPr>
-          <w:b/>
-        </w:rPr>
-        <w:t xml:space="preserve">Actor principal: </w:t>
-      </w:r>
-      <w:r>
-        <w:t xml:space="preserve">Administrador de catálogos / parametrización</w:t>
-      </w:r>
-    </w:p>
-    <w:p>
-      <w:pPr>
-        <w:pStyle w:val="Listaconvietas"/>
-      </w:pPr>
-      <w:r>
-        <w:rPr>
-          <w:b/>
-        </w:rPr>
-        <w:t xml:space="preserve">Actores secundarios: </w:t>
-      </w:r>
-      <w:r>
-        <w:t xml:space="preserve">Operador ACH</w:t>
-      </w:r>
-    </w:p>
-    <w:p>
-      <w:pPr>
-        <w:pStyle w:val="Listaconvietas"/>
-      </w:pPr>
-      <w:r>
-        <w:rPr>
-          <w:b/>
-        </w:rPr>
-        <w:t xml:space="preserve">Para qué sirve: </w:t>
-      </w:r>
-      <w:r>
-        <w:t xml:space="preserve">Identificar el concepto visible que se aplicará en el lote.</w:t>
-      </w:r>
-    </w:p>
-    <w:p>
-      <w:pPr>
-        <w:pStyle w:val="Listaconvietas"/>
-      </w:pPr>
-      <w:r>
-        <w:rPr>
-          <w:b/>
-        </w:rPr>
-        <w:t xml:space="preserve">Cuándo la usa: </w:t>
-      </w:r>
-      <w:r>
-        <w:t xml:space="preserve">Durante la preparación de transacciones o ciclos.</w:t>
-      </w:r>
-    </w:p>
-    <w:p>
-      <w:pPr>
-        <w:pStyle w:val="Listaconvietas"/>
-      </w:pPr>
-      <w:r>
-        <w:rPr>
-          <w:b/>
-        </w:rPr>
-        <w:t xml:space="preserve">Pasos funcionales: </w:t>
-      </w:r>
-      <w:r>
-        <w:t xml:space="preserve">Abrir el catálogo, validar el concepto mostrado y confirmar su uso funcional.</w:t>
-      </w:r>
-    </w:p>
-    <w:p>
-      <w:pPr>
-        <w:pStyle w:val="Listaconvietas"/>
-      </w:pPr>
-      <w:r>
-        <w:rPr>
-          <w:b/>
-        </w:rPr>
-        <w:t xml:space="preserve">Qué debe validar: </w:t>
-      </w:r>
-      <w:r>
-        <w:t xml:space="preserve">Que el concepto corresponda al lote del caso de prueba.</w:t>
-      </w:r>
-    </w:p>
-    <w:p>
-      <w:pPr>
-        <w:pStyle w:val="Listaconvietas"/>
-      </w:pPr>
-      <w:r>
-        <w:rPr>
-          <w:b/>
-        </w:rPr>
-        <w:t xml:space="preserve">Qué errores debe reportar: </w:t>
-      </w:r>
-      <w:r>
-        <w:t xml:space="preserve">Reportar conceptos incorrectos, vacíos o no disponibles.</w:t>
-      </w:r>
-    </w:p>
-    <w:p>
-      <w:pPr>
-        <w:pStyle w:val="Listaconvietas"/>
-      </w:pPr>
-      <w:r>
-        <w:rPr>
-          <w:b/>
-        </w:rPr>
-        <w:t xml:space="preserve">Captura asociada: </w:t>
-      </w:r>
-      <w:r>
-        <w:t xml:space="preserve">38_catalog_company_entry_descriptions.png</w:t>
-      </w:r>
-    </w:p>
-    <w:p>
-      <w:pPr>
-        <w:pStyle w:val="Ttulo2"/>
-      </w:pPr>
-      <w:r>
-        <w:t xml:space="preserve">35.11 Reglas por cámara</w:t>
-      </w:r>
-    </w:p>
-    <w:p>
-      <w:pPr>
-        <w:pStyle w:val="Normal"/>
-      </w:pPr>
-      <w:r>
-        <w:t xml:space="preserve">Centraliza la revisión de las reglas aplicadas por cámara.</w:t>
-      </w:r>
-    </w:p>
-    <w:p>
-      <w:pPr>
-        <w:pStyle w:val="Listaconvietas"/>
-      </w:pPr>
-      <w:r>
-        <w:rPr>
-          <w:b/>
-        </w:rPr>
-        <w:t xml:space="preserve">Actor principal: </w:t>
-      </w:r>
-      <w:r>
-        <w:t xml:space="preserve">Administrador funcional ACH</w:t>
-      </w:r>
-    </w:p>
-    <w:p>
-      <w:pPr>
-        <w:pStyle w:val="Listaconvietas"/>
-      </w:pPr>
-      <w:r>
-        <w:rPr>
-          <w:b/>
-        </w:rPr>
-        <w:t xml:space="preserve">Actores secundarios: </w:t>
-      </w:r>
-      <w:r>
-        <w:t xml:space="preserve">Operador ACH</w:t>
-      </w:r>
-    </w:p>
-    <w:p>
-      <w:pPr>
-        <w:pStyle w:val="Listaconvietas"/>
-      </w:pPr>
-      <w:r>
-        <w:rPr>
-          <w:b/>
-        </w:rPr>
-        <w:t xml:space="preserve">Para qué sirve: </w:t>
-      </w:r>
-      <w:r>
-        <w:t xml:space="preserve">Validar el comportamiento regulatorio esperado por cámara.</w:t>
-      </w:r>
-    </w:p>
-    <w:p>
-      <w:pPr>
-        <w:pStyle w:val="Listaconvietas"/>
-      </w:pPr>
-      <w:r>
-        <w:rPr>
-          <w:b/>
-        </w:rPr>
-        <w:t xml:space="preserve">Cuándo la usa: </w:t>
-      </w:r>
-      <w:r>
-        <w:t xml:space="preserve">Antes de crear transacciones o de verificar un rechazo o devolución.</w:t>
-      </w:r>
-    </w:p>
-    <w:p>
-      <w:pPr>
-        <w:pStyle w:val="Listaconvietas"/>
-      </w:pPr>
-      <w:r>
-        <w:rPr>
-          <w:b/>
-        </w:rPr>
-        <w:t xml:space="preserve">Pasos funcionales: </w:t>
-      </w:r>
-      <w:r>
-        <w:t xml:space="preserve">Abrir la pantalla, revisar la regla visible y contrastarla con el caso.</w:t>
-      </w:r>
-    </w:p>
-    <w:p>
-      <w:pPr>
-        <w:pStyle w:val="Listaconvietas"/>
-      </w:pPr>
-      <w:r>
-        <w:rPr>
-          <w:b/>
-        </w:rPr>
-        <w:t xml:space="preserve">Qué debe validar: </w:t>
-      </w:r>
-      <w:r>
-        <w:t xml:space="preserve">Que la cámara y la regla coincidan con el flujo esperado.</w:t>
-      </w:r>
-    </w:p>
-    <w:p>
-      <w:pPr>
-        <w:pStyle w:val="Listaconvietas"/>
-      </w:pPr>
-      <w:r>
-        <w:rPr>
-          <w:b/>
-        </w:rPr>
-        <w:t xml:space="preserve">Qué errores debe reportar: </w:t>
-      </w:r>
-      <w:r>
-        <w:t xml:space="preserve">Reportar reglas ausentes, aplicadas a la cámara equivocada o sin coherencia.</w:t>
-      </w:r>
-    </w:p>
-    <w:p>
-      <w:pPr>
-        <w:pStyle w:val="Listaconvietas"/>
-      </w:pPr>
-      <w:r>
-        <w:rPr>
-          <w:b/>
-        </w:rPr>
-        <w:t xml:space="preserve">Captura asociada: </w:t>
-      </w:r>
-      <w:r>
-        <w:t xml:space="preserve">39_transactions_clearing_house_rules.png</w:t>
-      </w:r>
-    </w:p>
-    <w:p>
-      <w:pPr>
-        <w:pStyle w:val="Ttulo2"/>
-      </w:pPr>
-      <w:r>
-        <w:t xml:space="preserve">35.12 Configuración de ciclos</w:t>
-      </w:r>
-    </w:p>
-    <w:p>
-      <w:pPr>
-        <w:pStyle w:val="Normal"/>
-      </w:pPr>
-      <w:r>
-        <w:t xml:space="preserve">Resume la administración de ciclos usada por la operación.</w:t>
-      </w:r>
-    </w:p>
-    <w:p>
-      <w:pPr>
-        <w:pStyle w:val="Listaconvietas"/>
-      </w:pPr>
-      <w:r>
-        <w:rPr>
-          <w:b/>
-        </w:rPr>
-        <w:t xml:space="preserve">Actor principal: </w:t>
-      </w:r>
-      <w:r>
-        <w:t xml:space="preserve">Administrador funcional ACH</w:t>
-      </w:r>
-    </w:p>
-    <w:p>
-      <w:pPr>
-        <w:pStyle w:val="Listaconvietas"/>
-      </w:pPr>
-      <w:r>
-        <w:rPr>
-          <w:b/>
-        </w:rPr>
-        <w:t xml:space="preserve">Actores secundarios: </w:t>
-      </w:r>
-      <w:r>
-        <w:t xml:space="preserve">Operador ACH; Revisor / validador operativo</w:t>
-      </w:r>
-    </w:p>
-    <w:p>
-      <w:pPr>
-        <w:pStyle w:val="Listaconvietas"/>
-      </w:pPr>
-      <w:r>
-        <w:rPr>
-          <w:b/>
-        </w:rPr>
-        <w:t xml:space="preserve">Para qué sirve: </w:t>
-      </w:r>
-      <w:r>
-        <w:t xml:space="preserve">Revisar vigencias, versionado y disponibilidad de ciclo.</w:t>
-      </w:r>
-    </w:p>
-    <w:p>
-      <w:pPr>
-        <w:pStyle w:val="Listaconvietas"/>
-      </w:pPr>
-      <w:r>
-        <w:rPr>
-          <w:b/>
-        </w:rPr>
-        <w:t xml:space="preserve">Cuándo la usa: </w:t>
-      </w:r>
-      <w:r>
-        <w:t xml:space="preserve">Antes de exportar, conciliar o validar una transacción por ciclo.</w:t>
-      </w:r>
-    </w:p>
-    <w:p>
-      <w:pPr>
-        <w:pStyle w:val="Listaconvietas"/>
-      </w:pPr>
-      <w:r>
-        <w:rPr>
-          <w:b/>
-        </w:rPr>
-        <w:t xml:space="preserve">Pasos funcionales: </w:t>
-      </w:r>
-      <w:r>
-        <w:t xml:space="preserve">Abrir la configuración, ubicar el ciclo y confirmar su vigencia visible.</w:t>
-      </w:r>
-    </w:p>
-    <w:p>
-      <w:pPr>
-        <w:pStyle w:val="Listaconvietas"/>
-      </w:pPr>
-      <w:r>
-        <w:rPr>
-          <w:b/>
-        </w:rPr>
-        <w:t xml:space="preserve">Qué debe validar: </w:t>
-      </w:r>
-      <w:r>
-        <w:t xml:space="preserve">Que el ciclo esté activo para el escenario de prueba.</w:t>
-      </w:r>
-    </w:p>
-    <w:p>
-      <w:pPr>
-        <w:pStyle w:val="Listaconvietas"/>
-      </w:pPr>
-      <w:r>
-        <w:rPr>
-          <w:b/>
-        </w:rPr>
-        <w:t xml:space="preserve">Qué errores debe reportar: </w:t>
-      </w:r>
-      <w:r>
-        <w:t xml:space="preserve">Reportar ciclos deshabilitados, fechas inválidas o cambios inesperados.</w:t>
-      </w:r>
-    </w:p>
-    <w:p>
-      <w:pPr>
-        <w:pStyle w:val="Listaconvietas"/>
-      </w:pPr>
-      <w:r>
-        <w:rPr>
-          <w:b/>
-        </w:rPr>
-        <w:t xml:space="preserve">Captura asociada: </w:t>
-      </w:r>
-      <w:r>
-        <w:t xml:space="preserve">40_transactions_cycle_configs.png</w:t>
-      </w:r>
-    </w:p>
-    <w:p>
-      <w:pPr>
-        <w:pStyle w:val="Ttulo2"/>
-      </w:pPr>
-      <w:r>
-        <w:t xml:space="preserve">35.13 Causales de devolución y rechazo por cámara</w:t>
-      </w:r>
-    </w:p>
-    <w:p>
-      <w:pPr>
-        <w:pStyle w:val="Normal"/>
-      </w:pPr>
-      <w:r>
-        <w:t xml:space="preserve">Agrupa los catálogos regulatorios visibles para devoluciones y rechazos.</w:t>
-      </w:r>
-    </w:p>
-    <w:p>
-      <w:pPr>
-        <w:pStyle w:val="Listaconvietas"/>
-      </w:pPr>
-      <w:r>
-        <w:rPr>
-          <w:b/>
-        </w:rPr>
-        <w:t xml:space="preserve">Actor principal: </w:t>
-      </w:r>
-      <w:r>
-        <w:t xml:space="preserve">Administrador funcional ACH</w:t>
-      </w:r>
-    </w:p>
-    <w:p>
-      <w:pPr>
-        <w:pStyle w:val="Listaconvietas"/>
-      </w:pPr>
-      <w:r>
-        <w:rPr>
-          <w:b/>
-        </w:rPr>
-        <w:t xml:space="preserve">Actores secundarios: </w:t>
-      </w:r>
-      <w:r>
-        <w:t xml:space="preserve">Revisor / validador operativo</w:t>
-      </w:r>
-    </w:p>
-    <w:p>
-      <w:pPr>
-        <w:pStyle w:val="Listaconvietas"/>
-      </w:pPr>
-      <w:r>
-        <w:rPr>
-          <w:b/>
-        </w:rPr>
-        <w:t xml:space="preserve">Para qué sirve: </w:t>
-      </w:r>
-      <w:r>
-        <w:t xml:space="preserve">Consultar la causal correcta según la cámara y el caso.</w:t>
-      </w:r>
-    </w:p>
-    <w:p>
-      <w:pPr>
-        <w:pStyle w:val="Listaconvietas"/>
-      </w:pPr>
-      <w:r>
-        <w:rPr>
-          <w:b/>
-        </w:rPr>
-        <w:t xml:space="preserve">Cuándo la usa: </w:t>
-      </w:r>
-      <w:r>
-        <w:t xml:space="preserve">Al revisar una devolución o un rechazo y antes de registrar evidencia.</w:t>
-      </w:r>
-    </w:p>
-    <w:p>
-      <w:pPr>
-        <w:pStyle w:val="Listaconvietas"/>
-      </w:pPr>
-      <w:r>
-        <w:rPr>
-          <w:b/>
-        </w:rPr>
-        <w:t xml:space="preserve">Pasos funcionales: </w:t>
-      </w:r>
-      <w:r>
-        <w:t xml:space="preserve">Abrir cada causal, comparar su descripción y validar que corresponda al flujo.</w:t>
-      </w:r>
-    </w:p>
-    <w:p>
-      <w:pPr>
-        <w:pStyle w:val="Listaconvietas"/>
-      </w:pPr>
-      <w:r>
-        <w:rPr>
-          <w:b/>
-        </w:rPr>
-        <w:t xml:space="preserve">Qué debe validar: </w:t>
-      </w:r>
-      <w:r>
-        <w:t xml:space="preserve">Que la causal visible coincida con el evento observado.</w:t>
-      </w:r>
-    </w:p>
-    <w:p>
-      <w:pPr>
-        <w:pStyle w:val="Listaconvietas"/>
-      </w:pPr>
-      <w:r>
-        <w:rPr>
-          <w:b/>
-        </w:rPr>
-        <w:t xml:space="preserve">Qué errores debe reportar: </w:t>
-      </w:r>
-      <w:r>
-        <w:t xml:space="preserve">Reportar causal ausente, texto erróneo o clasificación incorrecta.</w:t>
-      </w:r>
-    </w:p>
-    <w:p>
-      <w:pPr>
-        <w:pStyle w:val="Listaconvietas"/>
-      </w:pPr>
-      <w:r>
-        <w:rPr>
-          <w:b/>
-        </w:rPr>
-        <w:t xml:space="preserve">Captura asociada: </w:t>
-      </w:r>
-      <w:r>
-        <w:t xml:space="preserve">41_cenit_causales_devolucion.png; 42_cenit_causales_rechazo.png</w:t>
-      </w:r>
-    </w:p>
-    <w:p>
-      <w:pPr>
-        <w:pStyle w:val="Ttulo2"/>
-      </w:pPr>
-      <w:r>
-        <w:t xml:space="preserve">35.14 Políticas CENIT</w:t>
-      </w:r>
-    </w:p>
-    <w:p>
-      <w:pPr>
-        <w:pStyle w:val="Normal"/>
-      </w:pPr>
-      <w:r>
-        <w:t xml:space="preserve">Consolida las políticas visibles de transacción y prenotificación de CENIT.</w:t>
-      </w:r>
-    </w:p>
-    <w:p>
-      <w:pPr>
-        <w:pStyle w:val="Listaconvietas"/>
-      </w:pPr>
-      <w:r>
-        <w:rPr>
-          <w:b/>
-        </w:rPr>
-        <w:t xml:space="preserve">Actor principal: </w:t>
-      </w:r>
-      <w:r>
-        <w:t xml:space="preserve">Administrador funcional ACH</w:t>
-      </w:r>
-    </w:p>
-    <w:p>
-      <w:pPr>
-        <w:pStyle w:val="Listaconvietas"/>
-      </w:pPr>
-      <w:r>
-        <w:rPr>
-          <w:b/>
-        </w:rPr>
-        <w:t xml:space="preserve">Actores secundarios: </w:t>
-      </w:r>
-      <w:r>
-        <w:t xml:space="preserve">Operador ACH</w:t>
-      </w:r>
-    </w:p>
-    <w:p>
-      <w:pPr>
-        <w:pStyle w:val="Listaconvietas"/>
-      </w:pPr>
-      <w:r>
-        <w:rPr>
-          <w:b/>
-        </w:rPr>
-        <w:t xml:space="preserve">Para qué sirve: </w:t>
-      </w:r>
-      <w:r>
-        <w:t xml:space="preserve">Confirmar el criterio funcional que rige el caso de prueba.</w:t>
-      </w:r>
-    </w:p>
-    <w:p>
-      <w:pPr>
-        <w:pStyle w:val="Listaconvietas"/>
-      </w:pPr>
-      <w:r>
-        <w:rPr>
-          <w:b/>
-        </w:rPr>
-        <w:t xml:space="preserve">Cuándo la usa: </w:t>
-      </w:r>
-      <w:r>
-        <w:t xml:space="preserve">Antes de ejecutar un escenario que dependa de política CENIT.</w:t>
-      </w:r>
-    </w:p>
-    <w:p>
-      <w:pPr>
-        <w:pStyle w:val="Listaconvietas"/>
-      </w:pPr>
-      <w:r>
-        <w:rPr>
-          <w:b/>
-        </w:rPr>
-        <w:t xml:space="preserve">Pasos funcionales: </w:t>
-      </w:r>
-      <w:r>
-        <w:t xml:space="preserve">Abrir la política, revisar la regla y confirmar si aplica al escenario.</w:t>
-      </w:r>
-    </w:p>
-    <w:p>
-      <w:pPr>
-        <w:pStyle w:val="Listaconvietas"/>
-      </w:pPr>
-      <w:r>
-        <w:rPr>
-          <w:b/>
-        </w:rPr>
-        <w:t xml:space="preserve">Qué debe validar: </w:t>
-      </w:r>
-      <w:r>
-        <w:t xml:space="preserve">Que la política mostrada sea la correcta para la cámara.</w:t>
-      </w:r>
-    </w:p>
-    <w:p>
-      <w:pPr>
-        <w:pStyle w:val="Listaconvietas"/>
-      </w:pPr>
-      <w:r>
-        <w:rPr>
-          <w:b/>
-        </w:rPr>
-        <w:t xml:space="preserve">Qué errores debe reportar: </w:t>
-      </w:r>
-      <w:r>
-        <w:t xml:space="preserve">Reportar política faltante, inconsistente o no aplicable.</w:t>
-      </w:r>
-    </w:p>
-    <w:p>
-      <w:pPr>
-        <w:pStyle w:val="Listaconvietas"/>
-      </w:pPr>
-      <w:r>
-        <w:rPr>
-          <w:b/>
-        </w:rPr>
-        <w:t xml:space="preserve">Captura asociada: </w:t>
-      </w:r>
-      <w:r>
-        <w:t xml:space="preserve">43_cenit_politicas_transaccion.png; 44_cenit_politicas_prenotificacion.png</w:t>
-      </w:r>
-    </w:p>
-    <w:p>
-      <w:pPr>
-        <w:pStyle w:val="Ttulo2"/>
-      </w:pPr>
-      <w:r>
-        <w:t xml:space="preserve">35.15 Perfiles NACHA-M</w:t>
-      </w:r>
-    </w:p>
-    <w:p>
-      <w:pPr>
-        <w:pStyle w:val="Normal"/>
-      </w:pPr>
-      <w:r>
-        <w:t xml:space="preserve">Agrupa la administración de perfiles oficiales NACHA-M por cámara.</w:t>
-      </w:r>
-    </w:p>
-    <w:p>
-      <w:pPr>
-        <w:pStyle w:val="Listaconvietas"/>
-      </w:pPr>
-      <w:r>
-        <w:rPr>
-          <w:b/>
-        </w:rPr>
-        <w:t xml:space="preserve">Actor principal: </w:t>
-      </w:r>
-      <w:r>
-        <w:t xml:space="preserve">Administrador funcional ACH</w:t>
-      </w:r>
-    </w:p>
-    <w:p>
-      <w:pPr>
-        <w:pStyle w:val="Listaconvietas"/>
-      </w:pPr>
-      <w:r>
-        <w:rPr>
-          <w:b/>
-        </w:rPr>
-        <w:t xml:space="preserve">Actores secundarios: </w:t>
-      </w:r>
-      <w:r>
-        <w:t xml:space="preserve">Operador ACH</w:t>
-      </w:r>
-    </w:p>
-    <w:p>
-      <w:pPr>
-        <w:pStyle w:val="Listaconvietas"/>
-      </w:pPr>
-      <w:r>
-        <w:rPr>
-          <w:b/>
-        </w:rPr>
-        <w:t xml:space="preserve">Para qué sirve: </w:t>
-      </w:r>
-      <w:r>
-        <w:t xml:space="preserve">Consultar perfiles, versión y estado visible del perfil.</w:t>
-      </w:r>
-    </w:p>
-    <w:p>
-      <w:pPr>
-        <w:pStyle w:val="Listaconvietas"/>
-      </w:pPr>
-      <w:r>
-        <w:rPr>
-          <w:b/>
-        </w:rPr>
-        <w:t xml:space="preserve">Cuándo la usa: </w:t>
-      </w:r>
-      <w:r>
-        <w:t xml:space="preserve">Al preparar generación, exportación o validación operativa.</w:t>
-      </w:r>
-    </w:p>
-    <w:p>
-      <w:pPr>
-        <w:pStyle w:val="Listaconvietas"/>
-      </w:pPr>
-      <w:r>
-        <w:rPr>
-          <w:b/>
-        </w:rPr>
-        <w:t xml:space="preserve">Pasos funcionales: </w:t>
-      </w:r>
-      <w:r>
-        <w:t xml:space="preserve">Abrir el listado, entrar al perfil y revisar su detalle si existe registro.</w:t>
-      </w:r>
-    </w:p>
-    <w:p>
-      <w:pPr>
-        <w:pStyle w:val="Listaconvietas"/>
-      </w:pPr>
-      <w:r>
-        <w:rPr>
-          <w:b/>
-        </w:rPr>
-        <w:t xml:space="preserve">Qué debe validar: </w:t>
-      </w:r>
-      <w:r>
-        <w:t xml:space="preserve">Que el perfil corresponda a la cámara y a la versión esperada.</w:t>
-      </w:r>
-    </w:p>
-    <w:p>
-      <w:pPr>
-        <w:pStyle w:val="Listaconvietas"/>
-      </w:pPr>
-      <w:r>
-        <w:rPr>
-          <w:b/>
-        </w:rPr>
-        <w:t xml:space="preserve">Qué errores debe reportar: </w:t>
-      </w:r>
-      <w:r>
-        <w:t xml:space="preserve">Reportar perfil ausente, versión errada o detalle no navegable.</w:t>
-      </w:r>
-    </w:p>
-    <w:p>
-      <w:pPr>
-        <w:pStyle w:val="Listaconvietas"/>
-      </w:pPr>
-      <w:r>
-        <w:rPr>
-          <w:b/>
-        </w:rPr>
-        <w:t xml:space="preserve">Captura asociada: </w:t>
-      </w:r>
-      <w:r>
-        <w:t xml:space="preserve">45_nacha_config_perfiles.png; 46_nacha_config_perfil_detalle_si_existe.png</w:t>
-      </w:r>
-    </w:p>
-    <w:p>
-      <w:pPr>
-        <w:pStyle w:val="Ttulo2"/>
-      </w:pPr>
-      <w:r>
-        <w:t xml:space="preserve">35.16 Conciliación y reportes de rechazo</w:t>
-      </w:r>
-    </w:p>
-    <w:p>
-      <w:pPr>
-        <w:pStyle w:val="Normal"/>
-      </w:pPr>
-      <w:r>
-        <w:t xml:space="preserve">Reúne la consola de conciliación y el reporte de rechazos para validar resultados.</w:t>
-      </w:r>
-    </w:p>
-    <w:p>
-      <w:pPr>
-        <w:pStyle w:val="Listaconvietas"/>
-      </w:pPr>
-      <w:r>
-        <w:rPr>
-          <w:b/>
-        </w:rPr>
-        <w:t xml:space="preserve">Actor principal: </w:t>
-      </w:r>
-      <w:r>
-        <w:t xml:space="preserve">Revisor / validador operativo</w:t>
-      </w:r>
-    </w:p>
-    <w:p>
-      <w:pPr>
-        <w:pStyle w:val="Listaconvietas"/>
-      </w:pPr>
-      <w:r>
-        <w:rPr>
-          <w:b/>
-        </w:rPr>
-        <w:t xml:space="preserve">Actores secundarios: </w:t>
-      </w:r>
-      <w:r>
-        <w:t xml:space="preserve">Operador ACH; Usuario funcional de pruebas</w:t>
-      </w:r>
-    </w:p>
-    <w:p>
-      <w:pPr>
-        <w:pStyle w:val="Listaconvietas"/>
-      </w:pPr>
-      <w:r>
-        <w:rPr>
-          <w:b/>
-        </w:rPr>
-        <w:t xml:space="preserve">Para qué sirve: </w:t>
-      </w:r>
-      <w:r>
-        <w:t xml:space="preserve">Cruzar resultados, diferencias y rechazos visibles en la operación.</w:t>
-      </w:r>
-    </w:p>
-    <w:p>
-      <w:pPr>
-        <w:pStyle w:val="Listaconvietas"/>
-      </w:pPr>
-      <w:r>
-        <w:rPr>
-          <w:b/>
-        </w:rPr>
-        <w:t xml:space="preserve">Cuándo la usa: </w:t>
-      </w:r>
-      <w:r>
-        <w:t xml:space="preserve">Al cerrar una prueba o al revisar incidencias funcionales.</w:t>
-      </w:r>
-    </w:p>
-    <w:p>
-      <w:pPr>
-        <w:pStyle w:val="Listaconvietas"/>
-      </w:pPr>
-      <w:r>
-        <w:rPr>
-          <w:b/>
-        </w:rPr>
-        <w:t xml:space="preserve">Pasos funcionales: </w:t>
-      </w:r>
-      <w:r>
-        <w:t xml:space="preserve">Abrir conciliación, revisar diferencias y luego contrastar el reporte de rechazos.</w:t>
-      </w:r>
-    </w:p>
-    <w:p>
-      <w:pPr>
-        <w:pStyle w:val="Listaconvietas"/>
-      </w:pPr>
-      <w:r>
-        <w:rPr>
-          <w:b/>
-        </w:rPr>
-        <w:t xml:space="preserve">Qué debe validar: </w:t>
-      </w:r>
-      <w:r>
-        <w:t xml:space="preserve">Que los resultados coincidan con el caso de prueba y su evidencia.</w:t>
-      </w:r>
-    </w:p>
-    <w:p>
-      <w:pPr>
-        <w:pStyle w:val="Listaconvietas"/>
-      </w:pPr>
-      <w:r>
-        <w:rPr>
-          <w:b/>
-        </w:rPr>
-        <w:t xml:space="preserve">Qué errores debe reportar: </w:t>
-      </w:r>
-      <w:r>
-        <w:t xml:space="preserve">Reportar diferencias no explicadas, faltantes de rechazo o estados inconsistentes.</w:t>
-      </w:r>
-    </w:p>
-    <w:p>
-      <w:pPr>
-        <w:pStyle w:val="Listaconvietas"/>
-      </w:pPr>
-      <w:r>
-        <w:rPr>
-          <w:b/>
-        </w:rPr>
-        <w:t xml:space="preserve">Captura asociada: </w:t>
-      </w:r>
-      <w:r>
-        <w:t xml:space="preserve">47_nacha_operational_dashboard.png; 48_ach_reconciliation.png; 49_reports_rejections.png</w:t>
-      </w:r>
-    </w:p>
-    <w:p>
-      <w:pPr>
-        <w:pStyle w:val="Ttulo2"/>
-      </w:pPr>
-      <w:r>
-        <w:t xml:space="preserve">35.17 Dígito de verificación, si existe</w:t>
-      </w:r>
-    </w:p>
-    <w:p>
-      <w:pPr>
-        <w:pStyle w:val="Normal"/>
-      </w:pPr>
-      <w:r>
-        <w:t xml:space="preserve">Muestra el valor visible del dígito solo cuando la pantalla lo presenta.</w:t>
-      </w:r>
-    </w:p>
-    <w:p>
-      <w:pPr>
-        <w:pStyle w:val="Listaconvietas"/>
-      </w:pPr>
-      <w:r>
-        <w:rPr>
-          <w:b/>
-        </w:rPr>
-        <w:t xml:space="preserve">Actor principal: </w:t>
-      </w:r>
-      <w:r>
-        <w:t xml:space="preserve">Administrador de catálogos / parametrización</w:t>
-      </w:r>
-    </w:p>
-    <w:p>
-      <w:pPr>
-        <w:pStyle w:val="Listaconvietas"/>
-      </w:pPr>
-      <w:r>
-        <w:rPr>
-          <w:b/>
-        </w:rPr>
-        <w:t xml:space="preserve">Actores secundarios: </w:t>
-      </w:r>
-      <w:r>
-        <w:t xml:space="preserve">Operador ACH</w:t>
-      </w:r>
-    </w:p>
-    <w:p>
-      <w:pPr>
-        <w:pStyle w:val="Listaconvietas"/>
-      </w:pPr>
-      <w:r>
-        <w:rPr>
-          <w:b/>
-        </w:rPr>
-        <w:t xml:space="preserve">Para qué sirve: </w:t>
-      </w:r>
-      <w:r>
-        <w:t xml:space="preserve">Validar que el dato visible coincida con la entidad financiera mostrada.</w:t>
-      </w:r>
-    </w:p>
-    <w:p>
-      <w:pPr>
-        <w:pStyle w:val="Listaconvietas"/>
-      </w:pPr>
-      <w:r>
-        <w:rPr>
-          <w:b/>
-        </w:rPr>
-        <w:t xml:space="preserve">Cuándo la usa: </w:t>
-      </w:r>
-      <w:r>
-        <w:t xml:space="preserve">Al revisar la entidad financiera o el alta que exponga ese valor.</w:t>
-      </w:r>
-    </w:p>
-    <w:p>
-      <w:pPr>
-        <w:pStyle w:val="Listaconvietas"/>
-      </w:pPr>
-      <w:r>
-        <w:rPr>
-          <w:b/>
-        </w:rPr>
-        <w:t xml:space="preserve">Pasos funcionales: </w:t>
-      </w:r>
-      <w:r>
-        <w:t xml:space="preserve">Abrir la pantalla y confirmar si el dígito aparece como campo visible.</w:t>
-      </w:r>
-    </w:p>
-    <w:p>
-      <w:pPr>
-        <w:pStyle w:val="Listaconvietas"/>
-      </w:pPr>
-      <w:r>
-        <w:rPr>
-          <w:b/>
-        </w:rPr>
-        <w:t xml:space="preserve">Qué debe validar: </w:t>
-      </w:r>
-      <w:r>
-        <w:t xml:space="preserve">Que el valor mostrado sea consistente con la entidad y el formulario.</w:t>
-      </w:r>
-    </w:p>
-    <w:p>
-      <w:pPr>
-        <w:pStyle w:val="Listaconvietas"/>
-      </w:pPr>
-      <w:r>
-        <w:rPr>
-          <w:b/>
-        </w:rPr>
-        <w:t xml:space="preserve">Qué errores debe reportar: </w:t>
-      </w:r>
-      <w:r>
-        <w:t xml:space="preserve">Reportar si el campo no aparece, si está vacío o si el dato es inconsistente.</w:t>
-      </w:r>
-    </w:p>
-    <w:p>
-      <w:pPr>
-        <w:pStyle w:val="Listaconvietas"/>
-      </w:pPr>
-      <w:r>
-        <w:rPr>
-          <w:b/>
-        </w:rPr>
-        <w:t xml:space="preserve">Captura asociada: </w:t>
-      </w:r>
-      <w:r>
-        <w:t xml:space="preserve">32_financial_institutions_mantenimiento_digito_verificacion.png</w:t>
-      </w:r>
-    </w:p>
-    <w:p>
-      <w:pPr>
-        <w:pStyle w:val="Ttulo2"/>
-      </w:pPr>
-      <w:r>
-        <w:t xml:space="preserve">35.18 Seguridad NACHA-M, certificados digitales y sobre digital</w:t>
-      </w:r>
-    </w:p>
-    <w:p>
-      <w:pPr>
-        <w:pStyle w:val="Normal"/>
-      </w:pPr>
-      <w:r>
-        <w:t xml:space="preserve">Agrupa el panel de seguridad y las operaciones visibles sobre el sobre digital.</w:t>
-      </w:r>
-    </w:p>
-    <w:p>
-      <w:pPr>
-        <w:pStyle w:val="Listaconvietas"/>
-      </w:pPr>
-      <w:r>
-        <w:rPr>
-          <w:b/>
-        </w:rPr>
-        <w:t xml:space="preserve">Actor principal: </w:t>
-      </w:r>
-      <w:r>
-        <w:t xml:space="preserve">Administrador de certificados digitales</w:t>
-      </w:r>
-    </w:p>
-    <w:p>
-      <w:pPr>
-        <w:pStyle w:val="Listaconvietas"/>
-      </w:pPr>
-      <w:r>
-        <w:rPr>
-          <w:b/>
-        </w:rPr>
-        <w:t xml:space="preserve">Actores secundarios: </w:t>
-      </w:r>
-      <w:r>
-        <w:t xml:space="preserve">Soporte técnico funcional; Revisor / validador operativo</w:t>
-      </w:r>
-    </w:p>
-    <w:p>
-      <w:pPr>
-        <w:pStyle w:val="Listaconvietas"/>
-      </w:pPr>
-      <w:r>
-        <w:rPr>
-          <w:b/>
-        </w:rPr>
-        <w:t xml:space="preserve">Para qué sirve: </w:t>
-      </w:r>
-      <w:r>
-        <w:t xml:space="preserve">Administrar la operación visible de generación, cifrado, descifrado y auditoría.</w:t>
-      </w:r>
-    </w:p>
-    <w:p>
-      <w:pPr>
-        <w:pStyle w:val="Listaconvietas"/>
-      </w:pPr>
-      <w:r>
-        <w:rPr>
-          <w:b/>
-        </w:rPr>
-        <w:t xml:space="preserve">Cuándo la usa: </w:t>
-      </w:r>
-      <w:r>
-        <w:t xml:space="preserve">Durante pruebas de seguridad funcional o revisión de evidencias.</w:t>
-      </w:r>
-    </w:p>
-    <w:p>
-      <w:pPr>
-        <w:pStyle w:val="Listaconvietas"/>
-      </w:pPr>
-      <w:r>
-        <w:rPr>
-          <w:b/>
-        </w:rPr>
-        <w:t xml:space="preserve">Pasos funcionales: </w:t>
-      </w:r>
-      <w:r>
-        <w:t xml:space="preserve">Abrir el panel, entrar a la operación requerida y revisar el resultado visible.</w:t>
-      </w:r>
-    </w:p>
-    <w:p>
-      <w:pPr>
-        <w:pStyle w:val="Listaconvietas"/>
-      </w:pPr>
-      <w:r>
-        <w:rPr>
-          <w:b/>
-        </w:rPr>
-        <w:t xml:space="preserve">Qué debe validar: </w:t>
-      </w:r>
-      <w:r>
-        <w:t xml:space="preserve">Que la operación muestre el archivo esperado y no exponga datos sensibles.</w:t>
-      </w:r>
-    </w:p>
-    <w:p>
-      <w:pPr>
-        <w:pStyle w:val="Listaconvietas"/>
-      </w:pPr>
-      <w:r>
-        <w:rPr>
-          <w:b/>
-        </w:rPr>
-        <w:t xml:space="preserve">Qué errores debe reportar: </w:t>
-      </w:r>
-      <w:r>
-        <w:t xml:space="preserve">Reportar fallas de carga, mensajes ambiguos o exposición de información sensible.</w:t>
-      </w:r>
-    </w:p>
-    <w:p>
-      <w:pPr>
-        <w:pStyle w:val="Listaconvietas"/>
-      </w:pPr>
-      <w:r>
-        <w:rPr>
-          <w:b/>
-        </w:rPr>
-        <w:t xml:space="preserve">Captura asociada: </w:t>
-      </w:r>
-      <w:r>
-        <w:t xml:space="preserve">51_nacha_security_dashboard.png; 56_nacha_security_audit_sobre_digital.png; 59_nacha_manual_encrypt_sobre_digital.png; 60_nacha_manual_decrypt_sobre_digital.png; 61_sobre_digital_tool.png; 62_interoperabilidad_vector_oficial.png</w:t>
-      </w:r>
-    </w:p>
-    <w:p>
-      <w:pPr>
-        <w:pStyle w:val="Ttulo2"/>
-      </w:pPr>
-      <w:r>
-        <w:t xml:space="preserve">35.19 Gobierno de certificados digitales</w:t>
-      </w:r>
-    </w:p>
-    <w:p>
-      <w:pPr>
-        <w:pStyle w:val="Normal"/>
-      </w:pPr>
-      <w:r>
-        <w:t xml:space="preserve">Centraliza la consulta, versionado, estados y control visible de certificados.</w:t>
-      </w:r>
-    </w:p>
-    <w:p>
-      <w:pPr>
-        <w:pStyle w:val="Listaconvietas"/>
-      </w:pPr>
-      <w:r>
-        <w:rPr>
-          <w:b/>
-        </w:rPr>
-        <w:t xml:space="preserve">Actor principal: </w:t>
-      </w:r>
-      <w:r>
-        <w:t xml:space="preserve">Administrador de certificados digitales</w:t>
-      </w:r>
-    </w:p>
-    <w:p>
-      <w:pPr>
-        <w:pStyle w:val="Listaconvietas"/>
-      </w:pPr>
-      <w:r>
-        <w:rPr>
-          <w:b/>
-        </w:rPr>
-        <w:t xml:space="preserve">Actores secundarios: </w:t>
-      </w:r>
-      <w:r>
-        <w:t xml:space="preserve">Revisor / validador operativo</w:t>
-      </w:r>
-    </w:p>
-    <w:p>
-      <w:pPr>
-        <w:pStyle w:val="Listaconvietas"/>
-      </w:pPr>
-      <w:r>
-        <w:rPr>
-          <w:b/>
-        </w:rPr>
-        <w:t xml:space="preserve">Para qué sirve: </w:t>
-      </w:r>
-      <w:r>
-        <w:t xml:space="preserve">Revisar el estado operativo y el historial visible de cada certificado.</w:t>
-      </w:r>
-    </w:p>
-    <w:p>
-      <w:pPr>
-        <w:pStyle w:val="Listaconvietas"/>
-      </w:pPr>
-      <w:r>
-        <w:rPr>
-          <w:b/>
-        </w:rPr>
-        <w:t xml:space="preserve">Cuándo la usa: </w:t>
-      </w:r>
-      <w:r>
-        <w:t xml:space="preserve">Antes de generar, cifrar o validar una operación con certificado.</w:t>
-      </w:r>
-    </w:p>
-    <w:p>
-      <w:pPr>
-        <w:pStyle w:val="Listaconvietas"/>
-      </w:pPr>
-      <w:r>
-        <w:rPr>
-          <w:b/>
-        </w:rPr>
-        <w:t xml:space="preserve">Pasos funcionales: </w:t>
-      </w:r>
-      <w:r>
-        <w:t xml:space="preserve">Abrir certificados, revisar estado y vigencia, y entrar al historial si aplica.</w:t>
-      </w:r>
-    </w:p>
-    <w:p>
-      <w:pPr>
-        <w:pStyle w:val="Listaconvietas"/>
-      </w:pPr>
-      <w:r>
-        <w:rPr>
-          <w:b/>
-        </w:rPr>
-        <w:t xml:space="preserve">Qué debe validar: </w:t>
-      </w:r>
-      <w:r>
-        <w:t xml:space="preserve">Que el certificado mostrado esté vigente o tenga el estado visible esperado.</w:t>
-      </w:r>
-    </w:p>
-    <w:p>
-      <w:pPr>
-        <w:pStyle w:val="Listaconvietas"/>
-      </w:pPr>
-      <w:r>
-        <w:rPr>
-          <w:b/>
-        </w:rPr>
-        <w:t xml:space="preserve">Qué errores debe reportar: </w:t>
-      </w:r>
-      <w:r>
-        <w:t xml:space="preserve">Reportar certificados vencidos, estados no previstos o historial inaccesible.</w:t>
-      </w:r>
-    </w:p>
-    <w:p>
-      <w:pPr>
-        <w:pStyle w:val="Listaconvietas"/>
-      </w:pPr>
-      <w:r>
-        <w:rPr>
-          <w:b/>
-        </w:rPr>
-        <w:t xml:space="preserve">Captura asociada: </w:t>
-      </w:r>
-      <w:r>
-        <w:t xml:space="preserve">52_nacha_security_certificates_gobierno.png; 53_nacha_security_certificate_versions_historial.png; 54_nacha_security_certificates_estados_vigencia_si_visible.png; 55_nacha_security_certificates_rotacion_reemplazo_si_existe.png</w:t>
-      </w:r>
-    </w:p>
-    <w:p>
-      <w:pPr>
-        <w:pStyle w:val="Ttulo2"/>
-      </w:pPr>
-      <w:r>
-        <w:t xml:space="preserve">35.20 Naming reglamentario y archivo final por cámara</w:t>
-      </w:r>
-    </w:p>
-    <w:p>
-      <w:pPr>
-        <w:pStyle w:val="Normal"/>
-      </w:pPr>
-      <w:r>
-        <w:t xml:space="preserve">Resume la salida visible del archivo base, su variante cifrada y la exportación final.</w:t>
-      </w:r>
-    </w:p>
-    <w:p>
-      <w:pPr>
-        <w:pStyle w:val="Listaconvietas"/>
-      </w:pPr>
-      <w:r>
-        <w:rPr>
-          <w:b/>
-        </w:rPr>
-        <w:t xml:space="preserve">Actor principal: </w:t>
-      </w:r>
-      <w:r>
-        <w:t xml:space="preserve">Administrador de certificados digitales</w:t>
-      </w:r>
-    </w:p>
-    <w:p>
-      <w:pPr>
-        <w:pStyle w:val="Listaconvietas"/>
-      </w:pPr>
-      <w:r>
-        <w:rPr>
-          <w:b/>
-        </w:rPr>
-        <w:t xml:space="preserve">Actores secundarios: </w:t>
-      </w:r>
-      <w:r>
-        <w:t xml:space="preserve">Operador ACH</w:t>
-      </w:r>
-    </w:p>
-    <w:p>
-      <w:pPr>
-        <w:pStyle w:val="Listaconvietas"/>
-      </w:pPr>
-      <w:r>
-        <w:rPr>
-          <w:b/>
-        </w:rPr>
-        <w:t xml:space="preserve">Para qué sirve: </w:t>
-      </w:r>
-      <w:r>
-        <w:t xml:space="preserve">Confirmar el nombre visible del archivo y su relación con la cámara.</w:t>
-      </w:r>
-    </w:p>
-    <w:p>
-      <w:pPr>
-        <w:pStyle w:val="Listaconvietas"/>
-      </w:pPr>
-      <w:r>
-        <w:rPr>
-          <w:b/>
-        </w:rPr>
-        <w:t xml:space="preserve">Cuándo la usa: </w:t>
-      </w:r>
-      <w:r>
-        <w:t xml:space="preserve">Durante la generación base, el cifrado o la exportación desde ciclo.</w:t>
-      </w:r>
-    </w:p>
-    <w:p>
-      <w:pPr>
-        <w:pStyle w:val="Listaconvietas"/>
-      </w:pPr>
-      <w:r>
-        <w:rPr>
-          <w:b/>
-        </w:rPr>
-        <w:t xml:space="preserve">Pasos funcionales: </w:t>
-      </w:r>
-      <w:r>
-        <w:t xml:space="preserve">Generar el archivo, revisar el nombre visible y contrastarlo con la cámara usada.</w:t>
-      </w:r>
-    </w:p>
-    <w:p>
-      <w:pPr>
-        <w:pStyle w:val="Listaconvietas"/>
-      </w:pPr>
-      <w:r>
-        <w:rPr>
-          <w:b/>
-        </w:rPr>
-        <w:t xml:space="preserve">Qué debe validar: </w:t>
-      </w:r>
-      <w:r>
-        <w:t xml:space="preserve">Que el nombre base, el cifrado o el final se muestren solo si la pantalla lo expone.</w:t>
-      </w:r>
-    </w:p>
-    <w:p>
-      <w:pPr>
-        <w:pStyle w:val="Listaconvietas"/>
-      </w:pPr>
-      <w:r>
-        <w:rPr>
-          <w:b/>
-        </w:rPr>
-        <w:t xml:space="preserve">Qué errores debe reportar: </w:t>
-      </w:r>
-      <w:r>
-        <w:t xml:space="preserve">Reportar nombre ausente, extensión no visible o naming no coincidente con la cámara.</w:t>
-      </w:r>
-    </w:p>
-    <w:p>
-      <w:pPr>
-        <w:pStyle w:val="Listaconvietas"/>
-      </w:pPr>
-      <w:r>
-        <w:rPr>
-          <w:b/>
-        </w:rPr>
-        <w:t xml:space="preserve">Captura asociada: </w:t>
-      </w:r>
-      <w:r>
-        <w:t xml:space="preserve">57_nacha_generate_base.png; 58_nacha_generate_encrypted.png; 63_ach_cycles_nacha_export.png; 64_naming_archivo_base_por_camara_si_visible.png; 65_naming_archivo_final_env_si_visible.png</w:t>
-      </w:r>
-    </w:p>
-    <w:p>
-      <w:pPr>
-        <w:pStyle w:val="Ttulo1"/>
-      </w:pPr>
-      <w:r>
         <w:rPr>
           <w:rFonts w:ascii="Arial" w:hAnsi="Arial"/>
         </w:rPr>
-        <w:t>36. Cierre</w:t>
+        <w:t>35. Cierre</w:t>
       </w:r>
     </w:p>
     <w:p>

</xml_diff>